<commit_message>
feat: Dynamic ministry header with single template and chat fixes
- Add ministries.json with 21 ministry configurations (station codes, addresses)
- Implement shape/text box placeholder replacement in Word headers
- Handle line breaks in text boxes using BR_MARKER pattern
- Fix 'Back to Upload' button to clear chat history
- Reset intro message when chat is cleared while open
- Fix fetch path for ministry API (relative for subpath deployment)
- Update Template.docx with ministry placeholders
</commit_message>
<xml_diff>
--- a/appeal_templates/Template.docx
+++ b/appeal_templates/Template.docx
@@ -327,79 +327,7 @@
           <w:sz w:val="20"/>
           <w:szCs w:val="20"/>
         </w:rPr>
-        <w:t>]</w:t>
-      </w:r>
-      <w:r>
-        <w:rPr>
-          <w:rFonts w:ascii="Arial" w:hAnsi="Arial" w:cs="Arial"/>
-          <w:sz w:val="20"/>
-          <w:szCs w:val="20"/>
-        </w:rPr>
-        <w:t xml:space="preserve"> </w:t>
-      </w:r>
-      <w:r>
-        <w:rPr>
-          <w:rFonts w:ascii="Arial" w:hAnsi="Arial" w:cs="Arial"/>
-          <w:sz w:val="20"/>
-          <w:szCs w:val="20"/>
-        </w:rPr>
-        <w:t>is</w:t>
-      </w:r>
-      <w:r>
-        <w:rPr>
-          <w:rFonts w:ascii="Arial" w:hAnsi="Arial" w:cs="Arial"/>
-          <w:sz w:val="20"/>
-          <w:szCs w:val="20"/>
-        </w:rPr>
-        <w:t xml:space="preserve"> </w:t>
-      </w:r>
-      <w:r>
-        <w:rPr>
-          <w:rFonts w:ascii="Arial" w:hAnsi="Arial" w:cs="Arial"/>
-          <w:sz w:val="20"/>
-          <w:szCs w:val="20"/>
-        </w:rPr>
-        <w:t xml:space="preserve">a </w:t>
-      </w:r>
-      <w:r>
-        <w:rPr>
-          <w:rFonts w:ascii="Arial" w:hAnsi="Arial" w:cs="Arial"/>
-          <w:sz w:val="20"/>
-          <w:szCs w:val="20"/>
-        </w:rPr>
-        <w:t>[Age]</w:t>
-      </w:r>
-      <w:r>
-        <w:rPr>
-          <w:rFonts w:ascii="Arial" w:hAnsi="Arial" w:cs="Arial"/>
-          <w:sz w:val="20"/>
-          <w:szCs w:val="20"/>
-        </w:rPr>
-        <w:t xml:space="preserve">-year-old </w:t>
-      </w:r>
-      <w:r>
-        <w:rPr>
-          <w:rFonts w:ascii="Arial" w:hAnsi="Arial" w:cs="Arial"/>
-          <w:sz w:val="20"/>
-          <w:szCs w:val="20"/>
-        </w:rPr>
-        <w:t>[Gender]</w:t>
-      </w:r>
-      <w:r>
-        <w:rPr>
-          <w:rFonts w:ascii="Arial" w:hAnsi="Arial" w:cs="Arial"/>
-          <w:sz w:val="20"/>
-          <w:szCs w:val="20"/>
-        </w:rPr>
-        <w:t xml:space="preserve"> with past medical history of</w:t>
-      </w:r>
-      <w:r>
-        <w:rPr>
-          <w:rFonts w:ascii="Arial" w:hAnsi="Arial" w:cs="Arial"/>
-          <w:sz w:val="20"/>
-          <w:szCs w:val="20"/>
-        </w:rPr>
-        <w:t xml:space="preserve"> [</w:t>
+        <w:t>] is a [Age]-year-old [Gender] with past medical history of [</w:t>
       </w:r>
       <w:proofErr w:type="spellStart"/>
       <w:r>
@@ -417,15 +345,25 @@
           <w:sz w:val="20"/>
           <w:szCs w:val="20"/>
         </w:rPr>
-        <w:t xml:space="preserve">], </w:t>
-      </w:r>
-      <w:r>
-        <w:rPr>
-          <w:rFonts w:ascii="Arial" w:hAnsi="Arial" w:cs="Arial"/>
-          <w:sz w:val="20"/>
-          <w:szCs w:val="20"/>
-        </w:rPr>
-        <w:t xml:space="preserve">who presented to the </w:t>
+        <w:t>], who presented to the [</w:t>
+      </w:r>
+      <w:proofErr w:type="spellStart"/>
+      <w:r>
+        <w:rPr>
+          <w:rFonts w:ascii="Arial" w:hAnsi="Arial" w:cs="Arial"/>
+          <w:sz w:val="20"/>
+          <w:szCs w:val="20"/>
+        </w:rPr>
+        <w:t>PlaceofService</w:t>
+      </w:r>
+      <w:proofErr w:type="spellEnd"/>
+      <w:r>
+        <w:rPr>
+          <w:rFonts w:ascii="Arial" w:hAnsi="Arial" w:cs="Arial"/>
+          <w:sz w:val="20"/>
+          <w:szCs w:val="20"/>
+        </w:rPr>
+        <w:t xml:space="preserve">] on [DOS] for </w:t>
       </w:r>
       <w:r>
         <w:rPr>
@@ -435,71 +373,13 @@
         </w:rPr>
         <w:t>[</w:t>
       </w:r>
-      <w:proofErr w:type="spellStart"/>
-      <w:r>
-        <w:rPr>
-          <w:rFonts w:ascii="Arial" w:hAnsi="Arial" w:cs="Arial"/>
-          <w:sz w:val="20"/>
-          <w:szCs w:val="20"/>
-        </w:rPr>
-        <w:t>PlaceofService</w:t>
-      </w:r>
-      <w:proofErr w:type="spellEnd"/>
-      <w:r>
-        <w:rPr>
-          <w:rFonts w:ascii="Arial" w:hAnsi="Arial" w:cs="Arial"/>
-          <w:sz w:val="20"/>
-          <w:szCs w:val="20"/>
-        </w:rPr>
-        <w:t xml:space="preserve">] </w:t>
-      </w:r>
-      <w:r>
-        <w:rPr>
-          <w:rFonts w:ascii="Arial" w:hAnsi="Arial" w:cs="Arial"/>
-          <w:sz w:val="20"/>
-          <w:szCs w:val="20"/>
-        </w:rPr>
-        <w:t xml:space="preserve">on </w:t>
-      </w:r>
-      <w:r>
-        <w:rPr>
-          <w:rFonts w:ascii="Arial" w:hAnsi="Arial" w:cs="Arial"/>
-          <w:sz w:val="20"/>
-          <w:szCs w:val="20"/>
-        </w:rPr>
-        <w:t xml:space="preserve">[DOS] </w:t>
-      </w:r>
-      <w:r>
-        <w:rPr>
-          <w:rFonts w:ascii="Arial" w:hAnsi="Arial" w:cs="Arial"/>
-          <w:sz w:val="20"/>
-          <w:szCs w:val="20"/>
-        </w:rPr>
-        <w:t xml:space="preserve">for </w:t>
-      </w:r>
-      <w:r>
-        <w:rPr>
-          <w:rFonts w:ascii="Arial" w:hAnsi="Arial" w:cs="Arial"/>
-          <w:sz w:val="20"/>
-          <w:szCs w:val="20"/>
-        </w:rPr>
-        <w:t>[</w:t>
-      </w:r>
-      <w:r>
-        <w:rPr>
-          <w:rFonts w:ascii="Arial" w:hAnsi="Arial" w:cs="Arial"/>
-          <w:sz w:val="20"/>
-          <w:szCs w:val="20"/>
-        </w:rPr>
-        <w:t>Complaint].</w:t>
-      </w:r>
-      <w:r>
-        <w:rPr>
-          <w:rFonts w:ascii="Arial" w:hAnsi="Arial" w:cs="Arial"/>
-          <w:sz w:val="20"/>
-          <w:szCs w:val="20"/>
-        </w:rPr>
-        <w:t xml:space="preserve"> </w:t>
+      <w:r>
+        <w:rPr>
+          <w:rFonts w:ascii="Arial" w:hAnsi="Arial" w:cs="Arial"/>
+          <w:sz w:val="20"/>
+          <w:szCs w:val="20"/>
+        </w:rPr>
+        <w:t xml:space="preserve">Complaint]. </w:t>
       </w:r>
     </w:p>
     <w:p>
@@ -615,23 +495,7 @@
           <w:sz w:val="20"/>
           <w:szCs w:val="20"/>
         </w:rPr>
-        <w:t>dnightReason</w:t>
-      </w:r>
-      <w:r>
-        <w:rPr>
-          <w:rFonts w:ascii="Arial" w:hAnsi="Arial" w:cs="Arial"/>
-          <w:sz w:val="20"/>
-          <w:szCs w:val="20"/>
-        </w:rPr>
-        <w:t>2</w:t>
-      </w:r>
-      <w:r>
-        <w:rPr>
-          <w:rFonts w:ascii="Arial" w:hAnsi="Arial" w:cs="Arial"/>
-          <w:sz w:val="20"/>
-          <w:szCs w:val="20"/>
-        </w:rPr>
-        <w:t>]</w:t>
+        <w:t>dnightReason2]</w:t>
       </w:r>
       <w:r>
         <w:rPr>
@@ -946,7 +810,12 @@
       </w:r>
     </w:p>
     <w:sectPr>
-      <w:headerReference w:type="first" r:id="rId11"/>
+      <w:headerReference w:type="even" r:id="rId11"/>
+      <w:headerReference w:type="default" r:id="rId12"/>
+      <w:footerReference w:type="even" r:id="rId13"/>
+      <w:footerReference w:type="default" r:id="rId14"/>
+      <w:headerReference w:type="first" r:id="rId15"/>
+      <w:footerReference w:type="first" r:id="rId16"/>
       <w:pgSz w:w="12240" w:h="15840"/>
       <w:pgMar w:top="1620" w:right="2160" w:bottom="1620" w:left="720" w:header="720" w:footer="720" w:gutter="0"/>
       <w:cols w:space="720"/>
@@ -976,6 +845,36 @@
 </w:endnotes>
 </file>
 
+<file path=word/footer1.xml><?xml version="1.0" encoding="utf-8"?>
+<w:ftr xmlns:wpc="http://schemas.microsoft.com/office/word/2010/wordprocessingCanvas" xmlns:cx="http://schemas.microsoft.com/office/drawing/2014/chartex" xmlns:cx1="http://schemas.microsoft.com/office/drawing/2015/9/8/chartex" xmlns:cx2="http://schemas.microsoft.com/office/drawing/2015/10/21/chartex" xmlns:cx3="http://schemas.microsoft.com/office/drawing/2016/5/9/chartex" xmlns:cx4="http://schemas.microsoft.com/office/drawing/2016/5/10/chartex" xmlns:cx5="http://schemas.microsoft.com/office/drawing/2016/5/11/chartex" xmlns:cx6="http://schemas.microsoft.com/office/drawing/2016/5/12/chartex" xmlns:cx7="http://schemas.microsoft.com/office/drawing/2016/5/13/chartex" xmlns:cx8="http://schemas.microsoft.com/office/drawing/2016/5/14/chartex" xmlns:mc="http://schemas.openxmlformats.org/markup-compatibility/2006" xmlns:aink="http://schemas.microsoft.com/office/drawing/2016/ink" xmlns:am3d="http://schemas.microsoft.com/office/drawing/2017/model3d" xmlns:o="urn:schemas-microsoft-com:office:office" xmlns:oel="http://schemas.microsoft.com/office/2019/extlst" xmlns:r="http://schemas.openxmlformats.org/officeDocument/2006/relationships" xmlns:m="http://schemas.openxmlformats.org/officeDocument/2006/math" xmlns:v="urn:schemas-microsoft-com:vml" xmlns:wp14="http://schemas.microsoft.com/office/word/2010/wordprocessingDrawing" xmlns:wp="http://schemas.openxmlformats.org/drawingml/2006/wordprocessingDrawing" xmlns:w10="urn:schemas-microsoft-com:office:word" xmlns:w="http://schemas.openxmlformats.org/wordprocessingml/2006/main" xmlns:w14="http://schemas.microsoft.com/office/word/2010/wordml" xmlns:w15="http://schemas.microsoft.com/office/word/2012/wordml" xmlns:w16cex="http://schemas.microsoft.com/office/word/2018/wordml/cex" xmlns:w16cid="http://schemas.microsoft.com/office/word/2016/wordml/cid" xmlns:w16="http://schemas.microsoft.com/office/word/2018/wordml" xmlns:w16du="http://schemas.microsoft.com/office/word/2023/wordml/word16du" xmlns:w16sdtdh="http://schemas.microsoft.com/office/word/2020/wordml/sdtdatahash" xmlns:w16sdtfl="http://schemas.microsoft.com/office/word/2024/wordml/sdtformatlock" xmlns:w16se="http://schemas.microsoft.com/office/word/2015/wordml/symex" xmlns:wpg="http://schemas.microsoft.com/office/word/2010/wordprocessingGroup" xmlns:wpi="http://schemas.microsoft.com/office/word/2010/wordprocessingInk" xmlns:wne="http://schemas.microsoft.com/office/word/2006/wordml" xmlns:wps="http://schemas.microsoft.com/office/word/2010/wordprocessingShape" mc:Ignorable="w14 w15 w16se w16cid w16 w16cex w16sdtdh w16sdtfl w16du wp14">
+  <w:p>
+    <w:pPr>
+      <w:pStyle w:val="Footer"/>
+    </w:pPr>
+  </w:p>
+</w:ftr>
+</file>
+
+<file path=word/footer2.xml><?xml version="1.0" encoding="utf-8"?>
+<w:ftr xmlns:wpc="http://schemas.microsoft.com/office/word/2010/wordprocessingCanvas" xmlns:cx="http://schemas.microsoft.com/office/drawing/2014/chartex" xmlns:cx1="http://schemas.microsoft.com/office/drawing/2015/9/8/chartex" xmlns:cx2="http://schemas.microsoft.com/office/drawing/2015/10/21/chartex" xmlns:cx3="http://schemas.microsoft.com/office/drawing/2016/5/9/chartex" xmlns:cx4="http://schemas.microsoft.com/office/drawing/2016/5/10/chartex" xmlns:cx5="http://schemas.microsoft.com/office/drawing/2016/5/11/chartex" xmlns:cx6="http://schemas.microsoft.com/office/drawing/2016/5/12/chartex" xmlns:cx7="http://schemas.microsoft.com/office/drawing/2016/5/13/chartex" xmlns:cx8="http://schemas.microsoft.com/office/drawing/2016/5/14/chartex" xmlns:mc="http://schemas.openxmlformats.org/markup-compatibility/2006" xmlns:aink="http://schemas.microsoft.com/office/drawing/2016/ink" xmlns:am3d="http://schemas.microsoft.com/office/drawing/2017/model3d" xmlns:o="urn:schemas-microsoft-com:office:office" xmlns:oel="http://schemas.microsoft.com/office/2019/extlst" xmlns:r="http://schemas.openxmlformats.org/officeDocument/2006/relationships" xmlns:m="http://schemas.openxmlformats.org/officeDocument/2006/math" xmlns:v="urn:schemas-microsoft-com:vml" xmlns:wp14="http://schemas.microsoft.com/office/word/2010/wordprocessingDrawing" xmlns:wp="http://schemas.openxmlformats.org/drawingml/2006/wordprocessingDrawing" xmlns:w10="urn:schemas-microsoft-com:office:word" xmlns:w="http://schemas.openxmlformats.org/wordprocessingml/2006/main" xmlns:w14="http://schemas.microsoft.com/office/word/2010/wordml" xmlns:w15="http://schemas.microsoft.com/office/word/2012/wordml" xmlns:w16cex="http://schemas.microsoft.com/office/word/2018/wordml/cex" xmlns:w16cid="http://schemas.microsoft.com/office/word/2016/wordml/cid" xmlns:w16="http://schemas.microsoft.com/office/word/2018/wordml" xmlns:w16du="http://schemas.microsoft.com/office/word/2023/wordml/word16du" xmlns:w16sdtdh="http://schemas.microsoft.com/office/word/2020/wordml/sdtdatahash" xmlns:w16sdtfl="http://schemas.microsoft.com/office/word/2024/wordml/sdtformatlock" xmlns:w16se="http://schemas.microsoft.com/office/word/2015/wordml/symex" xmlns:wpg="http://schemas.microsoft.com/office/word/2010/wordprocessingGroup" xmlns:wpi="http://schemas.microsoft.com/office/word/2010/wordprocessingInk" xmlns:wne="http://schemas.microsoft.com/office/word/2006/wordml" xmlns:wps="http://schemas.microsoft.com/office/word/2010/wordprocessingShape" mc:Ignorable="w14 w15 w16se w16cid w16 w16cex w16sdtdh w16sdtfl w16du wp14">
+  <w:p>
+    <w:pPr>
+      <w:pStyle w:val="Footer"/>
+    </w:pPr>
+  </w:p>
+</w:ftr>
+</file>
+
+<file path=word/footer3.xml><?xml version="1.0" encoding="utf-8"?>
+<w:ftr xmlns:wpc="http://schemas.microsoft.com/office/word/2010/wordprocessingCanvas" xmlns:cx="http://schemas.microsoft.com/office/drawing/2014/chartex" xmlns:cx1="http://schemas.microsoft.com/office/drawing/2015/9/8/chartex" xmlns:cx2="http://schemas.microsoft.com/office/drawing/2015/10/21/chartex" xmlns:cx3="http://schemas.microsoft.com/office/drawing/2016/5/9/chartex" xmlns:cx4="http://schemas.microsoft.com/office/drawing/2016/5/10/chartex" xmlns:cx5="http://schemas.microsoft.com/office/drawing/2016/5/11/chartex" xmlns:cx6="http://schemas.microsoft.com/office/drawing/2016/5/12/chartex" xmlns:cx7="http://schemas.microsoft.com/office/drawing/2016/5/13/chartex" xmlns:cx8="http://schemas.microsoft.com/office/drawing/2016/5/14/chartex" xmlns:mc="http://schemas.openxmlformats.org/markup-compatibility/2006" xmlns:aink="http://schemas.microsoft.com/office/drawing/2016/ink" xmlns:am3d="http://schemas.microsoft.com/office/drawing/2017/model3d" xmlns:o="urn:schemas-microsoft-com:office:office" xmlns:oel="http://schemas.microsoft.com/office/2019/extlst" xmlns:r="http://schemas.openxmlformats.org/officeDocument/2006/relationships" xmlns:m="http://schemas.openxmlformats.org/officeDocument/2006/math" xmlns:v="urn:schemas-microsoft-com:vml" xmlns:wp14="http://schemas.microsoft.com/office/word/2010/wordprocessingDrawing" xmlns:wp="http://schemas.openxmlformats.org/drawingml/2006/wordprocessingDrawing" xmlns:w10="urn:schemas-microsoft-com:office:word" xmlns:w="http://schemas.openxmlformats.org/wordprocessingml/2006/main" xmlns:w14="http://schemas.microsoft.com/office/word/2010/wordml" xmlns:w15="http://schemas.microsoft.com/office/word/2012/wordml" xmlns:w16cex="http://schemas.microsoft.com/office/word/2018/wordml/cex" xmlns:w16cid="http://schemas.microsoft.com/office/word/2016/wordml/cid" xmlns:w16="http://schemas.microsoft.com/office/word/2018/wordml" xmlns:w16du="http://schemas.microsoft.com/office/word/2023/wordml/word16du" xmlns:w16sdtdh="http://schemas.microsoft.com/office/word/2020/wordml/sdtdatahash" xmlns:w16sdtfl="http://schemas.microsoft.com/office/word/2024/wordml/sdtformatlock" xmlns:w16se="http://schemas.microsoft.com/office/word/2015/wordml/symex" xmlns:wpg="http://schemas.microsoft.com/office/word/2010/wordprocessingGroup" xmlns:wpi="http://schemas.microsoft.com/office/word/2010/wordprocessingInk" xmlns:wne="http://schemas.microsoft.com/office/word/2006/wordml" xmlns:wps="http://schemas.microsoft.com/office/word/2010/wordprocessingShape" mc:Ignorable="w14 w15 w16se w16cid w16 w16cex w16sdtdh w16sdtfl w16du wp14">
+  <w:p>
+    <w:pPr>
+      <w:pStyle w:val="Footer"/>
+    </w:pPr>
+  </w:p>
+</w:ftr>
+</file>
+
 <file path=word/footnotes.xml><?xml version="1.0" encoding="utf-8"?>
 <w:footnotes xmlns:wpc="http://schemas.microsoft.com/office/word/2010/wordprocessingCanvas" xmlns:cx="http://schemas.microsoft.com/office/drawing/2014/chartex" xmlns:cx1="http://schemas.microsoft.com/office/drawing/2015/9/8/chartex" xmlns:cx2="http://schemas.microsoft.com/office/drawing/2015/10/21/chartex" xmlns:cx3="http://schemas.microsoft.com/office/drawing/2016/5/9/chartex" xmlns:cx4="http://schemas.microsoft.com/office/drawing/2016/5/10/chartex" xmlns:cx5="http://schemas.microsoft.com/office/drawing/2016/5/11/chartex" xmlns:cx6="http://schemas.microsoft.com/office/drawing/2016/5/12/chartex" xmlns:cx7="http://schemas.microsoft.com/office/drawing/2016/5/13/chartex" xmlns:cx8="http://schemas.microsoft.com/office/drawing/2016/5/14/chartex" xmlns:mc="http://schemas.openxmlformats.org/markup-compatibility/2006" xmlns:aink="http://schemas.microsoft.com/office/drawing/2016/ink" xmlns:am3d="http://schemas.microsoft.com/office/drawing/2017/model3d" xmlns:o="urn:schemas-microsoft-com:office:office" xmlns:oel="http://schemas.microsoft.com/office/2019/extlst" xmlns:r="http://schemas.openxmlformats.org/officeDocument/2006/relationships" xmlns:m="http://schemas.openxmlformats.org/officeDocument/2006/math" xmlns:v="urn:schemas-microsoft-com:vml" xmlns:wp14="http://schemas.microsoft.com/office/word/2010/wordprocessingDrawing" xmlns:wp="http://schemas.openxmlformats.org/drawingml/2006/wordprocessingDrawing" xmlns:w10="urn:schemas-microsoft-com:office:word" xmlns:w="http://schemas.openxmlformats.org/wordprocessingml/2006/main" xmlns:w14="http://schemas.microsoft.com/office/word/2010/wordml" xmlns:w15="http://schemas.microsoft.com/office/word/2012/wordml" xmlns:w16cex="http://schemas.microsoft.com/office/word/2018/wordml/cex" xmlns:w16cid="http://schemas.microsoft.com/office/word/2016/wordml/cid" xmlns:w16="http://schemas.microsoft.com/office/word/2018/wordml" xmlns:w16du="http://schemas.microsoft.com/office/word/2023/wordml/word16du" xmlns:w16sdtdh="http://schemas.microsoft.com/office/word/2020/wordml/sdtdatahash" xmlns:w16sdtfl="http://schemas.microsoft.com/office/word/2024/wordml/sdtformatlock" xmlns:w16se="http://schemas.microsoft.com/office/word/2015/wordml/symex" xmlns:wpg="http://schemas.microsoft.com/office/word/2010/wordprocessingGroup" xmlns:wpi="http://schemas.microsoft.com/office/word/2010/wordprocessingInk" xmlns:wne="http://schemas.microsoft.com/office/word/2006/wordml" xmlns:wps="http://schemas.microsoft.com/office/word/2010/wordprocessingShape" mc:Ignorable="w14 w15 w16se w16cid w16 w16cex w16sdtdh w16sdtfl w16du wp14">
   <w:footnote w:type="separator" w:id="-1">
@@ -996,6 +895,26 @@
 </file>
 
 <file path=word/header1.xml><?xml version="1.0" encoding="utf-8"?>
+<w:hdr xmlns:wpc="http://schemas.microsoft.com/office/word/2010/wordprocessingCanvas" xmlns:cx="http://schemas.microsoft.com/office/drawing/2014/chartex" xmlns:cx1="http://schemas.microsoft.com/office/drawing/2015/9/8/chartex" xmlns:cx2="http://schemas.microsoft.com/office/drawing/2015/10/21/chartex" xmlns:cx3="http://schemas.microsoft.com/office/drawing/2016/5/9/chartex" xmlns:cx4="http://schemas.microsoft.com/office/drawing/2016/5/10/chartex" xmlns:cx5="http://schemas.microsoft.com/office/drawing/2016/5/11/chartex" xmlns:cx6="http://schemas.microsoft.com/office/drawing/2016/5/12/chartex" xmlns:cx7="http://schemas.microsoft.com/office/drawing/2016/5/13/chartex" xmlns:cx8="http://schemas.microsoft.com/office/drawing/2016/5/14/chartex" xmlns:mc="http://schemas.openxmlformats.org/markup-compatibility/2006" xmlns:aink="http://schemas.microsoft.com/office/drawing/2016/ink" xmlns:am3d="http://schemas.microsoft.com/office/drawing/2017/model3d" xmlns:o="urn:schemas-microsoft-com:office:office" xmlns:oel="http://schemas.microsoft.com/office/2019/extlst" xmlns:r="http://schemas.openxmlformats.org/officeDocument/2006/relationships" xmlns:m="http://schemas.openxmlformats.org/officeDocument/2006/math" xmlns:v="urn:schemas-microsoft-com:vml" xmlns:wp14="http://schemas.microsoft.com/office/word/2010/wordprocessingDrawing" xmlns:wp="http://schemas.openxmlformats.org/drawingml/2006/wordprocessingDrawing" xmlns:w10="urn:schemas-microsoft-com:office:word" xmlns:w="http://schemas.openxmlformats.org/wordprocessingml/2006/main" xmlns:w14="http://schemas.microsoft.com/office/word/2010/wordml" xmlns:w15="http://schemas.microsoft.com/office/word/2012/wordml" xmlns:w16cex="http://schemas.microsoft.com/office/word/2018/wordml/cex" xmlns:w16cid="http://schemas.microsoft.com/office/word/2016/wordml/cid" xmlns:w16="http://schemas.microsoft.com/office/word/2018/wordml" xmlns:w16du="http://schemas.microsoft.com/office/word/2023/wordml/word16du" xmlns:w16sdtdh="http://schemas.microsoft.com/office/word/2020/wordml/sdtdatahash" xmlns:w16sdtfl="http://schemas.microsoft.com/office/word/2024/wordml/sdtformatlock" xmlns:w16se="http://schemas.microsoft.com/office/word/2015/wordml/symex" xmlns:wpg="http://schemas.microsoft.com/office/word/2010/wordprocessingGroup" xmlns:wpi="http://schemas.microsoft.com/office/word/2010/wordprocessingInk" xmlns:wne="http://schemas.microsoft.com/office/word/2006/wordml" xmlns:wps="http://schemas.microsoft.com/office/word/2010/wordprocessingShape" mc:Ignorable="w14 w15 w16se w16cid w16 w16cex w16sdtdh w16sdtfl w16du wp14">
+  <w:p>
+    <w:pPr>
+      <w:pStyle w:val="Header"/>
+    </w:pPr>
+  </w:p>
+</w:hdr>
+</file>
+
+<file path=word/header2.xml><?xml version="1.0" encoding="utf-8"?>
+<w:hdr xmlns:wpc="http://schemas.microsoft.com/office/word/2010/wordprocessingCanvas" xmlns:cx="http://schemas.microsoft.com/office/drawing/2014/chartex" xmlns:cx1="http://schemas.microsoft.com/office/drawing/2015/9/8/chartex" xmlns:cx2="http://schemas.microsoft.com/office/drawing/2015/10/21/chartex" xmlns:cx3="http://schemas.microsoft.com/office/drawing/2016/5/9/chartex" xmlns:cx4="http://schemas.microsoft.com/office/drawing/2016/5/10/chartex" xmlns:cx5="http://schemas.microsoft.com/office/drawing/2016/5/11/chartex" xmlns:cx6="http://schemas.microsoft.com/office/drawing/2016/5/12/chartex" xmlns:cx7="http://schemas.microsoft.com/office/drawing/2016/5/13/chartex" xmlns:cx8="http://schemas.microsoft.com/office/drawing/2016/5/14/chartex" xmlns:mc="http://schemas.openxmlformats.org/markup-compatibility/2006" xmlns:aink="http://schemas.microsoft.com/office/drawing/2016/ink" xmlns:am3d="http://schemas.microsoft.com/office/drawing/2017/model3d" xmlns:o="urn:schemas-microsoft-com:office:office" xmlns:oel="http://schemas.microsoft.com/office/2019/extlst" xmlns:r="http://schemas.openxmlformats.org/officeDocument/2006/relationships" xmlns:m="http://schemas.openxmlformats.org/officeDocument/2006/math" xmlns:v="urn:schemas-microsoft-com:vml" xmlns:wp14="http://schemas.microsoft.com/office/word/2010/wordprocessingDrawing" xmlns:wp="http://schemas.openxmlformats.org/drawingml/2006/wordprocessingDrawing" xmlns:w10="urn:schemas-microsoft-com:office:word" xmlns:w="http://schemas.openxmlformats.org/wordprocessingml/2006/main" xmlns:w14="http://schemas.microsoft.com/office/word/2010/wordml" xmlns:w15="http://schemas.microsoft.com/office/word/2012/wordml" xmlns:w16cex="http://schemas.microsoft.com/office/word/2018/wordml/cex" xmlns:w16cid="http://schemas.microsoft.com/office/word/2016/wordml/cid" xmlns:w16="http://schemas.microsoft.com/office/word/2018/wordml" xmlns:w16du="http://schemas.microsoft.com/office/word/2023/wordml/word16du" xmlns:w16sdtdh="http://schemas.microsoft.com/office/word/2020/wordml/sdtdatahash" xmlns:w16sdtfl="http://schemas.microsoft.com/office/word/2024/wordml/sdtformatlock" xmlns:w16se="http://schemas.microsoft.com/office/word/2015/wordml/symex" xmlns:wpg="http://schemas.microsoft.com/office/word/2010/wordprocessingGroup" xmlns:wpi="http://schemas.microsoft.com/office/word/2010/wordprocessingInk" xmlns:wne="http://schemas.microsoft.com/office/word/2006/wordml" xmlns:wps="http://schemas.microsoft.com/office/word/2010/wordprocessingShape" mc:Ignorable="w14 w15 w16se w16cid w16 w16cex w16sdtdh w16sdtfl w16du wp14">
+  <w:p>
+    <w:pPr>
+      <w:pStyle w:val="Header"/>
+    </w:pPr>
+  </w:p>
+</w:hdr>
+</file>
+
+<file path=word/header3.xml><?xml version="1.0" encoding="utf-8"?>
 <w:hdr xmlns:wpc="http://schemas.microsoft.com/office/word/2010/wordprocessingCanvas" xmlns:cx="http://schemas.microsoft.com/office/drawing/2014/chartex" xmlns:cx1="http://schemas.microsoft.com/office/drawing/2015/9/8/chartex" xmlns:cx2="http://schemas.microsoft.com/office/drawing/2015/10/21/chartex" xmlns:cx3="http://schemas.microsoft.com/office/drawing/2016/5/9/chartex" xmlns:cx4="http://schemas.microsoft.com/office/drawing/2016/5/10/chartex" xmlns:cx5="http://schemas.microsoft.com/office/drawing/2016/5/11/chartex" xmlns:cx6="http://schemas.microsoft.com/office/drawing/2016/5/12/chartex" xmlns:cx7="http://schemas.microsoft.com/office/drawing/2016/5/13/chartex" xmlns:cx8="http://schemas.microsoft.com/office/drawing/2016/5/14/chartex" xmlns:mc="http://schemas.openxmlformats.org/markup-compatibility/2006" xmlns:aink="http://schemas.microsoft.com/office/drawing/2016/ink" xmlns:am3d="http://schemas.microsoft.com/office/drawing/2017/model3d" xmlns:o="urn:schemas-microsoft-com:office:office" xmlns:oel="http://schemas.microsoft.com/office/2019/extlst" xmlns:r="http://schemas.openxmlformats.org/officeDocument/2006/relationships" xmlns:m="http://schemas.openxmlformats.org/officeDocument/2006/math" xmlns:v="urn:schemas-microsoft-com:vml" xmlns:wp14="http://schemas.microsoft.com/office/word/2010/wordprocessingDrawing" xmlns:wp="http://schemas.openxmlformats.org/drawingml/2006/wordprocessingDrawing" xmlns:w10="urn:schemas-microsoft-com:office:word" xmlns:w="http://schemas.openxmlformats.org/wordprocessingml/2006/main" xmlns:w14="http://schemas.microsoft.com/office/word/2010/wordml" xmlns:w15="http://schemas.microsoft.com/office/word/2012/wordml" xmlns:w16cex="http://schemas.microsoft.com/office/word/2018/wordml/cex" xmlns:w16cid="http://schemas.microsoft.com/office/word/2016/wordml/cid" xmlns:w16="http://schemas.microsoft.com/office/word/2018/wordml" xmlns:w16du="http://schemas.microsoft.com/office/word/2023/wordml/word16du" xmlns:w16sdtdh="http://schemas.microsoft.com/office/word/2020/wordml/sdtdatahash" xmlns:w16sdtfl="http://schemas.microsoft.com/office/word/2024/wordml/sdtformatlock" xmlns:w16se="http://schemas.microsoft.com/office/word/2015/wordml/symex" xmlns:wpg="http://schemas.microsoft.com/office/word/2010/wordprocessingGroup" xmlns:wpi="http://schemas.microsoft.com/office/word/2010/wordprocessingInk" xmlns:wne="http://schemas.microsoft.com/office/word/2006/wordml" xmlns:wps="http://schemas.microsoft.com/office/word/2010/wordprocessingShape" mc:Ignorable="w14 w15 w16se w16cid w16 w16cex w16sdtdh w16sdtfl w16du wp14">
   <w:p>
     <w:pPr>
@@ -1208,16 +1127,16 @@
       <mc:AlternateContent>
         <mc:Choice Requires="wps">
           <w:drawing>
-            <wp:anchor distT="0" distB="0" distL="114300" distR="114300" simplePos="0" relativeHeight="251658242" behindDoc="0" locked="1" layoutInCell="1" allowOverlap="1" wp14:anchorId="4F6CCF41" wp14:editId="5AAC2AA8">
+            <wp:anchor distT="0" distB="0" distL="114300" distR="114300" simplePos="0" relativeHeight="251658242" behindDoc="0" locked="1" layoutInCell="1" allowOverlap="1" wp14:anchorId="4F6CCF41" wp14:editId="1FF6F238">
               <wp:simplePos x="0" y="0"/>
               <wp:positionH relativeFrom="column">
-                <wp:posOffset>466725</wp:posOffset>
+                <wp:posOffset>463550</wp:posOffset>
               </wp:positionH>
               <wp:positionV relativeFrom="paragraph">
-                <wp:posOffset>876300</wp:posOffset>
+                <wp:posOffset>873125</wp:posOffset>
               </wp:positionV>
-              <wp:extent cx="1828800" cy="751840"/>
-              <wp:effectExtent l="0" t="0" r="0" b="10160"/>
+              <wp:extent cx="2626995" cy="805180"/>
+              <wp:effectExtent l="0" t="0" r="1905" b="13970"/>
               <wp:wrapNone/>
               <wp:docPr id="39" name="Text Box 39">
                 <a:extLst xmlns:a="http://schemas.openxmlformats.org/drawingml/2006/main">
@@ -1234,7 +1153,7 @@
                     <wps:spPr>
                       <a:xfrm>
                         <a:off x="0" y="0"/>
-                        <a:ext cx="1828800" cy="751840"/>
+                        <a:ext cx="2626995" cy="805180"/>
                       </a:xfrm>
                       <a:prstGeom prst="rect">
                         <a:avLst/>
@@ -1249,46 +1168,109 @@
                         <w:p>
                           <w:pPr>
                             <w:pStyle w:val="smallcopy785"/>
+                            <w:spacing w:after="0" w:line="240" w:lineRule="auto"/>
                           </w:pPr>
                           <w:r>
                             <w:rPr>
                               <w:b/>
                               <w:bCs/>
                             </w:rPr>
-                            <w:t>DePaul Hospital</w:t>
+                            <w:t>[</w:t>
+                          </w:r>
+                          <w:proofErr w:type="spellStart"/>
+                          <w:r>
+                            <w:rPr>
+                              <w:b/>
+                              <w:bCs/>
+                            </w:rPr>
+                            <w:t>MinistryName</w:t>
+                          </w:r>
+                          <w:proofErr w:type="spellEnd"/>
+                          <w:r>
+                            <w:rPr>
+                              <w:b/>
+                              <w:bCs/>
+                            </w:rPr>
+                            <w:t>]</w:t>
+                          </w:r>
+                          <w:r>
+                            <w:rPr>
+                              <w:b/>
+                              <w:bCs/>
+                            </w:rPr>
+                            <w:br/>
                           </w:r>
                           <w:r>
                             <w:br/>
                           </w:r>
                           <w:r>
-                            <w:t>12303 DePaul Drive</w:t>
+                            <w:t>[</w:t>
+                          </w:r>
+                          <w:proofErr w:type="spellStart"/>
+                          <w:r>
+                            <w:t>MinistryAddress</w:t>
+                          </w:r>
+                          <w:proofErr w:type="spellEnd"/>
+                          <w:r>
+                            <w:t>]</w:t>
                           </w:r>
                           <w:r>
                             <w:br/>
-                            <w:t>St. Louis, MO 63044</w:t>
+                          </w:r>
+                          <w:r>
+                            <w:br/>
+                          </w:r>
+                          <w:r>
+                            <w:t>[</w:t>
+                          </w:r>
+                          <w:proofErr w:type="spellStart"/>
+                          <w:r>
+                            <w:t>MinistryCity</w:t>
+                          </w:r>
+                          <w:proofErr w:type="spellEnd"/>
+                          <w:r>
+                            <w:t>], [</w:t>
+                          </w:r>
+                          <w:proofErr w:type="spellStart"/>
+                          <w:r>
+                            <w:t>MinistryState</w:t>
+                          </w:r>
+                          <w:proofErr w:type="spellEnd"/>
+                          <w:r>
+                            <w:t>] [</w:t>
+                          </w:r>
+                          <w:proofErr w:type="spellStart"/>
+                          <w:r>
+                            <w:t>MinistryZip</w:t>
+                          </w:r>
+                          <w:proofErr w:type="spellEnd"/>
+                          <w:r>
+                            <w:t>]</w:t>
                           </w:r>
                         </w:p>
                         <w:p>
                           <w:pPr>
                             <w:pStyle w:val="smallcopy785"/>
+                            <w:spacing w:after="0" w:line="240" w:lineRule="auto"/>
+                          </w:pPr>
+                        </w:p>
+                        <w:p>
+                          <w:pPr>
+                            <w:pStyle w:val="smallcopy785"/>
+                            <w:spacing w:after="0"/>
+                            <w:rPr>
+                              <w:rFonts w:cs="Arial"/>
+                            </w:rPr>
                           </w:pPr>
                           <w:r>
                             <w:t>phone:</w:t>
                           </w:r>
                           <w:r>
                             <w:tab/>
-                            <w:t>314-344-6000</w:t>
                           </w:r>
-                        </w:p>
-                        <w:p>
-                          <w:pPr>
-                            <w:rPr>
-                              <w:rFonts w:ascii="Arial" w:hAnsi="Arial" w:cs="Arial"/>
-                              <w:color w:val="001F5F"/>
-                              <w:sz w:val="14"/>
-                              <w:szCs w:val="14"/>
-                            </w:rPr>
-                          </w:pPr>
+                          <w:r>
+                            <w:t>[MinistryPhone]</w:t>
+                          </w:r>
                         </w:p>
                       </w:txbxContent>
                     </wps:txbx>
@@ -1312,52 +1294,115 @@
         </mc:Choice>
         <mc:Fallback>
           <w:pict>
-            <v:shape w14:anchorId="4F6CCF41" id="Text Box 39" o:spid="_x0000_s1028" type="#_x0000_t202" style="position:absolute;margin-left:36.75pt;margin-top:69pt;width:2in;height:59.2pt;z-index:251658242;visibility:visible;mso-wrap-style:square;mso-width-percent:0;mso-height-percent:0;mso-wrap-distance-left:9pt;mso-wrap-distance-top:0;mso-wrap-distance-right:9pt;mso-wrap-distance-bottom:0;mso-position-horizontal:absolute;mso-position-horizontal-relative:text;mso-position-vertical:absolute;mso-position-vertical-relative:text;mso-width-percent:0;mso-height-percent:0;mso-width-relative:margin;mso-height-relative:margin;v-text-anchor:top" o:gfxdata="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" filled="f" stroked="f" strokeweight=".5pt">
+            <v:shape w14:anchorId="4F6CCF41" id="Text Box 39" o:spid="_x0000_s1028" type="#_x0000_t202" style="position:absolute;margin-left:36.5pt;margin-top:68.75pt;width:206.85pt;height:63.4pt;z-index:251658242;visibility:visible;mso-wrap-style:square;mso-width-percent:0;mso-height-percent:0;mso-wrap-distance-left:9pt;mso-wrap-distance-top:0;mso-wrap-distance-right:9pt;mso-wrap-distance-bottom:0;mso-position-horizontal:absolute;mso-position-horizontal-relative:text;mso-position-vertical:absolute;mso-position-vertical-relative:text;mso-width-percent:0;mso-height-percent:0;mso-width-relative:margin;mso-height-relative:margin;v-text-anchor:top" o:gfxdata="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" filled="f" stroked="f" strokeweight=".5pt">
               <v:textbox inset="0,0,0,0">
                 <w:txbxContent>
                   <w:p>
                     <w:pPr>
                       <w:pStyle w:val="smallcopy785"/>
+                      <w:spacing w:after="0" w:line="240" w:lineRule="auto"/>
                     </w:pPr>
                     <w:r>
                       <w:rPr>
                         <w:b/>
                         <w:bCs/>
                       </w:rPr>
-                      <w:t>DePaul Hospital</w:t>
+                      <w:t>[</w:t>
+                    </w:r>
+                    <w:proofErr w:type="spellStart"/>
+                    <w:r>
+                      <w:rPr>
+                        <w:b/>
+                        <w:bCs/>
+                      </w:rPr>
+                      <w:t>MinistryName</w:t>
+                    </w:r>
+                    <w:proofErr w:type="spellEnd"/>
+                    <w:r>
+                      <w:rPr>
+                        <w:b/>
+                        <w:bCs/>
+                      </w:rPr>
+                      <w:t>]</w:t>
+                    </w:r>
+                    <w:r>
+                      <w:rPr>
+                        <w:b/>
+                        <w:bCs/>
+                      </w:rPr>
+                      <w:br/>
                     </w:r>
                     <w:r>
                       <w:br/>
                     </w:r>
                     <w:r>
-                      <w:t>12303 DePaul Drive</w:t>
+                      <w:t>[</w:t>
+                    </w:r>
+                    <w:proofErr w:type="spellStart"/>
+                    <w:r>
+                      <w:t>MinistryAddress</w:t>
+                    </w:r>
+                    <w:proofErr w:type="spellEnd"/>
+                    <w:r>
+                      <w:t>]</w:t>
                     </w:r>
                     <w:r>
                       <w:br/>
-                      <w:t>St. Louis, MO 63044</w:t>
+                    </w:r>
+                    <w:r>
+                      <w:br/>
+                    </w:r>
+                    <w:r>
+                      <w:t>[</w:t>
+                    </w:r>
+                    <w:proofErr w:type="spellStart"/>
+                    <w:r>
+                      <w:t>MinistryCity</w:t>
+                    </w:r>
+                    <w:proofErr w:type="spellEnd"/>
+                    <w:r>
+                      <w:t>], [</w:t>
+                    </w:r>
+                    <w:proofErr w:type="spellStart"/>
+                    <w:r>
+                      <w:t>MinistryState</w:t>
+                    </w:r>
+                    <w:proofErr w:type="spellEnd"/>
+                    <w:r>
+                      <w:t>] [</w:t>
+                    </w:r>
+                    <w:proofErr w:type="spellStart"/>
+                    <w:r>
+                      <w:t>MinistryZip</w:t>
+                    </w:r>
+                    <w:proofErr w:type="spellEnd"/>
+                    <w:r>
+                      <w:t>]</w:t>
                     </w:r>
                   </w:p>
                   <w:p>
                     <w:pPr>
                       <w:pStyle w:val="smallcopy785"/>
+                      <w:spacing w:after="0" w:line="240" w:lineRule="auto"/>
+                    </w:pPr>
+                  </w:p>
+                  <w:p>
+                    <w:pPr>
+                      <w:pStyle w:val="smallcopy785"/>
+                      <w:spacing w:after="0"/>
+                      <w:rPr>
+                        <w:rFonts w:cs="Arial"/>
+                      </w:rPr>
                     </w:pPr>
                     <w:r>
                       <w:t>phone:</w:t>
                     </w:r>
                     <w:r>
                       <w:tab/>
-                      <w:t>314-344-6000</w:t>
                     </w:r>
-                  </w:p>
-                  <w:p>
-                    <w:pPr>
-                      <w:rPr>
-                        <w:rFonts w:ascii="Arial" w:hAnsi="Arial" w:cs="Arial"/>
-                        <w:color w:val="001F5F"/>
-                        <w:sz w:val="14"/>
-                        <w:szCs w:val="14"/>
-                      </w:rPr>
-                    </w:pPr>
+                    <w:r>
+                      <w:t>[MinistryPhone]</w:t>
+                    </w:r>
                   </w:p>
                 </w:txbxContent>
               </v:textbox>
@@ -1372,13 +1417,13 @@
         <w:noProof/>
       </w:rPr>
       <w:drawing>
-        <wp:anchor distT="0" distB="0" distL="114300" distR="114300" simplePos="0" relativeHeight="251658240" behindDoc="1" locked="1" layoutInCell="1" allowOverlap="1" wp14:anchorId="15A44514" wp14:editId="5ACA1B55">
+        <wp:anchor distT="0" distB="0" distL="114300" distR="114300" simplePos="0" relativeHeight="251658240" behindDoc="1" locked="1" layoutInCell="1" allowOverlap="1" wp14:anchorId="15A44514" wp14:editId="4AC3D6BB">
           <wp:simplePos x="0" y="0"/>
           <wp:positionH relativeFrom="page">
-            <wp:posOffset>0</wp:posOffset>
+            <wp:align>right</wp:align>
           </wp:positionH>
           <wp:positionV relativeFrom="page">
-            <wp:posOffset>0</wp:posOffset>
+            <wp:posOffset>142875</wp:posOffset>
           </wp:positionV>
           <wp:extent cx="7762875" cy="10048875"/>
           <wp:effectExtent l="0" t="0" r="9525" b="9525"/>

</xml_diff>

<commit_message>
Update app, templates, and static files
</commit_message>
<xml_diff>
--- a/appeal_templates/Template.docx
+++ b/appeal_templates/Template.docx
@@ -534,7 +534,7 @@
     </w:p>
     <w:p>
       <w:pPr>
-        <w:ind w:left="720"/>
+        <w:ind w:left="576" w:firstLine="144"/>
         <w:jc w:val="both"/>
         <w:rPr>
           <w:rFonts w:ascii="Arial" w:hAnsi="Arial" w:cs="Arial"/>
@@ -548,6 +548,54 @@
           <w:sz w:val="20"/>
           <w:szCs w:val="20"/>
         </w:rPr>
+        <w:t>[</w:t>
+      </w:r>
+      <w:proofErr w:type="spellStart"/>
+      <w:r>
+        <w:rPr>
+          <w:rFonts w:ascii="Arial" w:hAnsi="Arial" w:cs="Arial"/>
+          <w:sz w:val="20"/>
+          <w:szCs w:val="20"/>
+        </w:rPr>
+        <w:t>ClosingSummary</w:t>
+      </w:r>
+      <w:proofErr w:type="spellEnd"/>
+      <w:r>
+        <w:rPr>
+          <w:rFonts w:ascii="Arial" w:hAnsi="Arial" w:cs="Arial"/>
+          <w:sz w:val="20"/>
+          <w:szCs w:val="20"/>
+        </w:rPr>
+        <w:t>]</w:t>
+      </w:r>
+    </w:p>
+    <w:p>
+      <w:pPr>
+        <w:ind w:left="576" w:firstLine="144"/>
+        <w:jc w:val="both"/>
+        <w:rPr>
+          <w:rFonts w:ascii="Arial" w:hAnsi="Arial" w:cs="Arial"/>
+          <w:sz w:val="20"/>
+          <w:szCs w:val="20"/>
+        </w:rPr>
+      </w:pPr>
+    </w:p>
+    <w:p>
+      <w:pPr>
+        <w:ind w:left="720"/>
+        <w:jc w:val="both"/>
+        <w:rPr>
+          <w:rFonts w:ascii="Arial" w:hAnsi="Arial" w:cs="Arial"/>
+          <w:sz w:val="20"/>
+          <w:szCs w:val="20"/>
+        </w:rPr>
+      </w:pPr>
+      <w:r>
+        <w:rPr>
+          <w:rFonts w:ascii="Arial" w:hAnsi="Arial" w:cs="Arial"/>
+          <w:sz w:val="20"/>
+          <w:szCs w:val="20"/>
+        </w:rPr>
         <w:t>In my medical opinion, the standard decision timeframe would seriously jeopardize the enrollee’s health and recovery outcomes, and I respectfully request an expedited reconsideration. Accordingly, Section 40.8 of the Medicare Managed Care and Part D Appeals Guidance demands that Medicare Advantage Organizations (MAO) “process [the request] as expedited.” And Section 50.8 reiterates that MAO may not dismiss this “valid, timely appeal request of an adverse coverage decision solely because [the] enrollee is concurrently receiving or has already received the item/service/drug that is the subject of the appeal.”</w:t>
       </w:r>
     </w:p>
@@ -608,6 +656,7 @@
           <w:sz w:val="20"/>
           <w:szCs w:val="20"/>
         </w:rPr>
+        <w:lastRenderedPageBreak/>
         <w:t xml:space="preserve">Additionally note that per CMS, reconsideration dismissals are addressed under Subpart M §422.582 (f), and instances where enrollees are without financial liability fall outside of Subpart M. </w:t>
       </w:r>
     </w:p>
@@ -2219,7 +2268,6 @@
   <w:style w:type="character" w:default="1" w:styleId="DefaultParagraphFont">
     <w:name w:val="Default Paragraph Font"/>
     <w:uiPriority w:val="1"/>
-    <w:semiHidden/>
     <w:unhideWhenUsed/>
   </w:style>
   <w:style w:type="table" w:default="1" w:styleId="TableNormal">
@@ -2759,25 +2807,6 @@
 </file>
 
 <file path=customXml/item1.xml><?xml version="1.0" encoding="utf-8"?>
-<?mso-contentType ?>
-<FormTemplates xmlns="http://schemas.microsoft.com/sharepoint/v3/contenttype/forms">
-  <Display>DocumentLibraryForm</Display>
-  <Edit>DocumentLibraryForm</Edit>
-  <New>DocumentLibraryForm</New>
-</FormTemplates>
-</file>
-
-<file path=customXml/item2.xml><?xml version="1.0" encoding="utf-8"?>
-<b:Sources xmlns:b="http://schemas.openxmlformats.org/officeDocument/2006/bibliography" xmlns="http://schemas.openxmlformats.org/officeDocument/2006/bibliography" SelectedStyle="\APASixthEditionOfficeOnline.xsl" StyleName="APA" Version="6"/>
-</file>
-
-<file path=customXml/item3.xml><?xml version="1.0" encoding="utf-8"?>
-<p:properties xmlns:p="http://schemas.microsoft.com/office/2006/metadata/properties" xmlns:xsi="http://www.w3.org/2001/XMLSchema-instance" xmlns:pc="http://schemas.microsoft.com/office/infopath/2007/PartnerControls">
-  <documentManagement/>
-</p:properties>
-</file>
-
-<file path=customXml/item4.xml><?xml version="1.0" encoding="utf-8"?>
 <ct:contentTypeSchema xmlns:ct="http://schemas.microsoft.com/office/2006/metadata/contentType" xmlns:ma="http://schemas.microsoft.com/office/2006/metadata/properties/metaAttributes" ct:_="" ma:_="" ma:contentTypeName="Document" ma:contentTypeID="0x0101000A114B0B3830C04AB963F756186C82BD" ma:contentTypeVersion="3" ma:contentTypeDescription="Create a new document." ma:contentTypeScope="" ma:versionID="da4925ea29c2577d7340c01072ff392d">
   <xsd:schema xmlns:xsd="http://www.w3.org/2001/XMLSchema" xmlns:xs="http://www.w3.org/2001/XMLSchema" xmlns:p="http://schemas.microsoft.com/office/2006/metadata/properties" xmlns:ns2="6b3e150c-167c-4381-8b11-1779c06e76d3" targetNamespace="http://schemas.microsoft.com/office/2006/metadata/properties" ma:root="true" ma:fieldsID="942a06f3e13e5d125af727ff383ccc47" ns2:_="">
     <xsd:import namespace="6b3e150c-167c-4381-8b11-1779c06e76d3"/>
@@ -2915,32 +2944,26 @@
 </ct:contentTypeSchema>
 </file>
 
-<file path=customXml/itemProps1.xml><?xml version="1.0" encoding="utf-8"?>
-<ds:datastoreItem xmlns:ds="http://schemas.openxmlformats.org/officeDocument/2006/customXml" ds:itemID="{B99CBB0A-662A-4A92-8A4E-68C02AD54ACD}">
-  <ds:schemaRefs>
-    <ds:schemaRef ds:uri="http://schemas.microsoft.com/sharepoint/v3/contenttype/forms"/>
-  </ds:schemaRefs>
-</ds:datastoreItem>
+<file path=customXml/item2.xml><?xml version="1.0" encoding="utf-8"?>
+<p:properties xmlns:p="http://schemas.microsoft.com/office/2006/metadata/properties" xmlns:xsi="http://www.w3.org/2001/XMLSchema-instance" xmlns:pc="http://schemas.microsoft.com/office/infopath/2007/PartnerControls">
+  <documentManagement/>
+</p:properties>
 </file>
 
-<file path=customXml/itemProps2.xml><?xml version="1.0" encoding="utf-8"?>
-<ds:datastoreItem xmlns:ds="http://schemas.openxmlformats.org/officeDocument/2006/customXml" ds:itemID="{99BE0D53-B08D-44F0-9E0B-4BFC01292C66}">
-  <ds:schemaRefs>
-    <ds:schemaRef ds:uri="http://schemas.openxmlformats.org/officeDocument/2006/bibliography"/>
-  </ds:schemaRefs>
-</ds:datastoreItem>
+<file path=customXml/item3.xml><?xml version="1.0" encoding="utf-8"?>
+<b:Sources xmlns:b="http://schemas.openxmlformats.org/officeDocument/2006/bibliography" xmlns="http://schemas.openxmlformats.org/officeDocument/2006/bibliography" SelectedStyle="\APASixthEditionOfficeOnline.xsl" StyleName="APA" Version="6"/>
 </file>
 
-<file path=customXml/itemProps3.xml><?xml version="1.0" encoding="utf-8"?>
-<ds:datastoreItem xmlns:ds="http://schemas.openxmlformats.org/officeDocument/2006/customXml" ds:itemID="{0CDF7EEF-1D5F-4E5B-B336-12B29F0D0CB1}">
-  <ds:schemaRefs>
-    <ds:schemaRef ds:uri="http://schemas.microsoft.com/office/2006/metadata/properties"/>
-    <ds:schemaRef ds:uri="http://schemas.microsoft.com/office/infopath/2007/PartnerControls"/>
-  </ds:schemaRefs>
-</ds:datastoreItem>
+<file path=customXml/item4.xml><?xml version="1.0" encoding="utf-8"?>
+<?mso-contentType ?>
+<FormTemplates xmlns="http://schemas.microsoft.com/sharepoint/v3/contenttype/forms">
+  <Display>DocumentLibraryForm</Display>
+  <Edit>DocumentLibraryForm</Edit>
+  <New>DocumentLibraryForm</New>
+</FormTemplates>
 </file>
 
-<file path=customXml/itemProps4.xml><?xml version="1.0" encoding="utf-8"?>
+<file path=customXml/itemProps1.xml><?xml version="1.0" encoding="utf-8"?>
 <ds:datastoreItem xmlns:ds="http://schemas.openxmlformats.org/officeDocument/2006/customXml" ds:itemID="{0F0D98F9-9E41-4A41-96FC-B8FE3225B420}">
   <ds:schemaRefs>
     <ds:schemaRef ds:uri="http://schemas.microsoft.com/office/2006/metadata/contentType"/>
@@ -2956,4 +2979,29 @@
     <ds:schemaRef ds:uri="http://schemas.microsoft.com/internal/obd"/>
   </ds:schemaRefs>
 </ds:datastoreItem>
+</file>
+
+<file path=customXml/itemProps2.xml><?xml version="1.0" encoding="utf-8"?>
+<ds:datastoreItem xmlns:ds="http://schemas.openxmlformats.org/officeDocument/2006/customXml" ds:itemID="{0CDF7EEF-1D5F-4E5B-B336-12B29F0D0CB1}">
+  <ds:schemaRefs>
+    <ds:schemaRef ds:uri="http://schemas.microsoft.com/office/2006/metadata/properties"/>
+    <ds:schemaRef ds:uri="http://schemas.microsoft.com/office/infopath/2007/PartnerControls"/>
+  </ds:schemaRefs>
+</ds:datastoreItem>
+</file>
+
+<file path=customXml/itemProps3.xml><?xml version="1.0" encoding="utf-8"?>
+<ds:datastoreItem xmlns:ds="http://schemas.openxmlformats.org/officeDocument/2006/customXml" ds:itemID="{99BE0D53-B08D-44F0-9E0B-4BFC01292C66}">
+  <ds:schemaRefs>
+    <ds:schemaRef ds:uri="http://schemas.openxmlformats.org/officeDocument/2006/bibliography"/>
+  </ds:schemaRefs>
+</ds:datastoreItem>
+</file>
+
+<file path=customXml/itemProps4.xml><?xml version="1.0" encoding="utf-8"?>
+<ds:datastoreItem xmlns:ds="http://schemas.openxmlformats.org/officeDocument/2006/customXml" ds:itemID="{B99CBB0A-662A-4A92-8A4E-68C02AD54ACD}">
+  <ds:schemaRefs>
+    <ds:schemaRef ds:uri="http://schemas.microsoft.com/sharepoint/v3/contenttype/forms"/>
+  </ds:schemaRefs>
+</ds:datastoreItem>
 </file>
</xml_diff>

<commit_message>
Align MN1/MN2 prompts with appeal.html template, filter embedded appeal letters, fix Langfuse evaluator input limits
</commit_message>
<xml_diff>
--- a/appeal_templates/Template.docx
+++ b/appeal_templates/Template.docx
@@ -19,6 +19,9 @@
       </w:r>
       <w:r>
         <w:t>[Street Address]</w:t>
+      </w:r>
+      <w:r>
+        <w:tab/>
       </w:r>
     </w:p>
     <w:p>
@@ -409,39 +412,33 @@
           <w:sz w:val="20"/>
           <w:szCs w:val="20"/>
         </w:rPr>
-        <w:t>The first midnight was medically necessary for</w:t>
-      </w:r>
-      <w:r>
-        <w:rPr>
-          <w:rFonts w:ascii="Arial" w:hAnsi="Arial" w:cs="Arial"/>
-          <w:sz w:val="20"/>
-          <w:szCs w:val="20"/>
-        </w:rPr>
-        <w:t xml:space="preserve"> [M</w:t>
-      </w:r>
-      <w:r>
-        <w:rPr>
-          <w:rFonts w:ascii="Arial" w:hAnsi="Arial" w:cs="Arial"/>
-          <w:sz w:val="20"/>
-          <w:szCs w:val="20"/>
-        </w:rPr>
-        <w:t>i</w:t>
-      </w:r>
-      <w:r>
-        <w:rPr>
-          <w:rFonts w:ascii="Arial" w:hAnsi="Arial" w:cs="Arial"/>
-          <w:sz w:val="20"/>
-          <w:szCs w:val="20"/>
-        </w:rPr>
-        <w:t>dnightReason1]</w:t>
-      </w:r>
-      <w:r>
-        <w:rPr>
-          <w:rFonts w:ascii="Arial" w:hAnsi="Arial" w:cs="Arial"/>
-          <w:sz w:val="20"/>
-          <w:szCs w:val="20"/>
-        </w:rPr>
-        <w:t xml:space="preserve">. </w:t>
+        <w:t xml:space="preserve">During the first midnight, the </w:t>
+      </w:r>
+      <w:proofErr w:type="gramStart"/>
+      <w:r>
+        <w:rPr>
+          <w:rFonts w:ascii="Arial" w:hAnsi="Arial" w:cs="Arial"/>
+          <w:sz w:val="20"/>
+          <w:szCs w:val="20"/>
+        </w:rPr>
+        <w:t>member</w:t>
+      </w:r>
+      <w:proofErr w:type="gramEnd"/>
+      <w:r>
+        <w:rPr>
+          <w:rFonts w:ascii="Arial" w:hAnsi="Arial" w:cs="Arial"/>
+          <w:sz w:val="20"/>
+          <w:szCs w:val="20"/>
+        </w:rPr>
+        <w:t xml:space="preserve"> continued to require inpatient care for [MidnightReason1].</w:t>
+      </w:r>
+      <w:r>
+        <w:rPr>
+          <w:rFonts w:ascii="Arial" w:hAnsi="Arial" w:cs="Arial"/>
+          <w:sz w:val="20"/>
+          <w:szCs w:val="20"/>
+        </w:rPr>
+        <w:t xml:space="preserve"> </w:t>
       </w:r>
     </w:p>
     <w:p>
@@ -457,7 +454,7 @@
     </w:p>
     <w:p>
       <w:pPr>
-        <w:ind w:left="720"/>
+        <w:ind w:left="576" w:firstLine="144"/>
         <w:jc w:val="both"/>
         <w:rPr>
           <w:rFonts w:ascii="Arial" w:hAnsi="Arial" w:cs="Arial"/>
@@ -471,59 +468,62 @@
           <w:sz w:val="20"/>
           <w:szCs w:val="20"/>
         </w:rPr>
-        <w:t>The second midnight was medically necessary for</w:t>
-      </w:r>
-      <w:r>
-        <w:rPr>
-          <w:rFonts w:ascii="Arial" w:hAnsi="Arial" w:cs="Arial"/>
-          <w:sz w:val="20"/>
-          <w:szCs w:val="20"/>
-        </w:rPr>
-        <w:t xml:space="preserve"> [M</w:t>
-      </w:r>
-      <w:r>
-        <w:rPr>
-          <w:rFonts w:ascii="Arial" w:hAnsi="Arial" w:cs="Arial"/>
-          <w:sz w:val="20"/>
-          <w:szCs w:val="20"/>
-        </w:rPr>
-        <w:t>i</w:t>
-      </w:r>
-      <w:r>
-        <w:rPr>
-          <w:rFonts w:ascii="Arial" w:hAnsi="Arial" w:cs="Arial"/>
-          <w:sz w:val="20"/>
-          <w:szCs w:val="20"/>
-        </w:rPr>
-        <w:t>dnightReason2]</w:t>
-      </w:r>
-      <w:r>
-        <w:rPr>
-          <w:rFonts w:ascii="Arial" w:hAnsi="Arial" w:cs="Arial"/>
-          <w:sz w:val="20"/>
-          <w:szCs w:val="20"/>
-        </w:rPr>
-        <w:t xml:space="preserve">, </w:t>
-      </w:r>
-      <w:r>
-        <w:rPr>
-          <w:rFonts w:ascii="Arial" w:hAnsi="Arial" w:cs="Arial"/>
-          <w:sz w:val="20"/>
-          <w:szCs w:val="20"/>
-        </w:rPr>
-        <w:t xml:space="preserve">which </w:t>
-      </w:r>
-      <w:r>
-        <w:rPr>
-          <w:rFonts w:ascii="Arial" w:hAnsi="Arial" w:cs="Arial"/>
-          <w:sz w:val="20"/>
-          <w:szCs w:val="20"/>
-        </w:rPr>
-        <w:t xml:space="preserve">meets 2MN requiring inpatient level of care. </w:t>
-      </w:r>
-    </w:p>
-    <w:p>
-      <w:pPr>
+        <w:t xml:space="preserve">During the second midnight, the </w:t>
+      </w:r>
+      <w:proofErr w:type="gramStart"/>
+      <w:r>
+        <w:rPr>
+          <w:rFonts w:ascii="Arial" w:hAnsi="Arial" w:cs="Arial"/>
+          <w:sz w:val="20"/>
+          <w:szCs w:val="20"/>
+        </w:rPr>
+        <w:t>member</w:t>
+      </w:r>
+      <w:proofErr w:type="gramEnd"/>
+      <w:r>
+        <w:rPr>
+          <w:rFonts w:ascii="Arial" w:hAnsi="Arial" w:cs="Arial"/>
+          <w:sz w:val="20"/>
+          <w:szCs w:val="20"/>
+        </w:rPr>
+        <w:t xml:space="preserve"> still required hospital-level care due to</w:t>
+      </w:r>
+      <w:r>
+        <w:rPr>
+          <w:rFonts w:ascii="Arial" w:hAnsi="Arial" w:cs="Arial"/>
+          <w:sz w:val="20"/>
+          <w:szCs w:val="20"/>
+        </w:rPr>
+        <w:t xml:space="preserve"> </w:t>
+      </w:r>
+      <w:r>
+        <w:rPr>
+          <w:rFonts w:ascii="Arial" w:hAnsi="Arial" w:cs="Arial"/>
+          <w:sz w:val="20"/>
+          <w:szCs w:val="20"/>
+        </w:rPr>
+        <w:t>[MidnightReason</w:t>
+      </w:r>
+      <w:r>
+        <w:rPr>
+          <w:rFonts w:ascii="Arial" w:hAnsi="Arial" w:cs="Arial"/>
+          <w:sz w:val="20"/>
+          <w:szCs w:val="20"/>
+        </w:rPr>
+        <w:t>2</w:t>
+      </w:r>
+      <w:r>
+        <w:rPr>
+          <w:rFonts w:ascii="Arial" w:hAnsi="Arial" w:cs="Arial"/>
+          <w:sz w:val="20"/>
+          <w:szCs w:val="20"/>
+        </w:rPr>
+        <w:t>].</w:t>
+      </w:r>
+    </w:p>
+    <w:p>
+      <w:pPr>
+        <w:ind w:left="576" w:firstLine="144"/>
         <w:jc w:val="both"/>
         <w:rPr>
           <w:rFonts w:ascii="Arial" w:hAnsi="Arial" w:cs="Arial"/>
@@ -2807,6 +2807,12 @@
 </file>
 
 <file path=customXml/item1.xml><?xml version="1.0" encoding="utf-8"?>
+<p:properties xmlns:p="http://schemas.microsoft.com/office/2006/metadata/properties" xmlns:xsi="http://www.w3.org/2001/XMLSchema-instance" xmlns:pc="http://schemas.microsoft.com/office/infopath/2007/PartnerControls">
+  <documentManagement/>
+</p:properties>
+</file>
+
+<file path=customXml/item2.xml><?xml version="1.0" encoding="utf-8"?>
 <ct:contentTypeSchema xmlns:ct="http://schemas.microsoft.com/office/2006/metadata/contentType" xmlns:ma="http://schemas.microsoft.com/office/2006/metadata/properties/metaAttributes" ct:_="" ma:_="" ma:contentTypeName="Document" ma:contentTypeID="0x0101000A114B0B3830C04AB963F756186C82BD" ma:contentTypeVersion="3" ma:contentTypeDescription="Create a new document." ma:contentTypeScope="" ma:versionID="da4925ea29c2577d7340c01072ff392d">
   <xsd:schema xmlns:xsd="http://www.w3.org/2001/XMLSchema" xmlns:xs="http://www.w3.org/2001/XMLSchema" xmlns:p="http://schemas.microsoft.com/office/2006/metadata/properties" xmlns:ns2="6b3e150c-167c-4381-8b11-1779c06e76d3" targetNamespace="http://schemas.microsoft.com/office/2006/metadata/properties" ma:root="true" ma:fieldsID="942a06f3e13e5d125af727ff383ccc47" ns2:_="">
     <xsd:import namespace="6b3e150c-167c-4381-8b11-1779c06e76d3"/>
@@ -2944,17 +2950,7 @@
 </ct:contentTypeSchema>
 </file>
 
-<file path=customXml/item2.xml><?xml version="1.0" encoding="utf-8"?>
-<p:properties xmlns:p="http://schemas.microsoft.com/office/2006/metadata/properties" xmlns:xsi="http://www.w3.org/2001/XMLSchema-instance" xmlns:pc="http://schemas.microsoft.com/office/infopath/2007/PartnerControls">
-  <documentManagement/>
-</p:properties>
-</file>
-
 <file path=customXml/item3.xml><?xml version="1.0" encoding="utf-8"?>
-<b:Sources xmlns:b="http://schemas.openxmlformats.org/officeDocument/2006/bibliography" xmlns="http://schemas.openxmlformats.org/officeDocument/2006/bibliography" SelectedStyle="\APASixthEditionOfficeOnline.xsl" StyleName="APA" Version="6"/>
-</file>
-
-<file path=customXml/item4.xml><?xml version="1.0" encoding="utf-8"?>
 <?mso-contentType ?>
 <FormTemplates xmlns="http://schemas.microsoft.com/sharepoint/v3/contenttype/forms">
   <Display>DocumentLibraryForm</Display>
@@ -2963,7 +2959,20 @@
 </FormTemplates>
 </file>
 
+<file path=customXml/item4.xml><?xml version="1.0" encoding="utf-8"?>
+<b:Sources xmlns:b="http://schemas.openxmlformats.org/officeDocument/2006/bibliography" xmlns="http://schemas.openxmlformats.org/officeDocument/2006/bibliography" SelectedStyle="\APASixthEditionOfficeOnline.xsl" StyleName="APA" Version="6"/>
+</file>
+
 <file path=customXml/itemProps1.xml><?xml version="1.0" encoding="utf-8"?>
+<ds:datastoreItem xmlns:ds="http://schemas.openxmlformats.org/officeDocument/2006/customXml" ds:itemID="{0CDF7EEF-1D5F-4E5B-B336-12B29F0D0CB1}">
+  <ds:schemaRefs>
+    <ds:schemaRef ds:uri="http://schemas.microsoft.com/office/2006/metadata/properties"/>
+    <ds:schemaRef ds:uri="http://schemas.microsoft.com/office/infopath/2007/PartnerControls"/>
+  </ds:schemaRefs>
+</ds:datastoreItem>
+</file>
+
+<file path=customXml/itemProps2.xml><?xml version="1.0" encoding="utf-8"?>
 <ds:datastoreItem xmlns:ds="http://schemas.openxmlformats.org/officeDocument/2006/customXml" ds:itemID="{0F0D98F9-9E41-4A41-96FC-B8FE3225B420}">
   <ds:schemaRefs>
     <ds:schemaRef ds:uri="http://schemas.microsoft.com/office/2006/metadata/contentType"/>
@@ -2981,27 +2990,18 @@
 </ds:datastoreItem>
 </file>
 
-<file path=customXml/itemProps2.xml><?xml version="1.0" encoding="utf-8"?>
-<ds:datastoreItem xmlns:ds="http://schemas.openxmlformats.org/officeDocument/2006/customXml" ds:itemID="{0CDF7EEF-1D5F-4E5B-B336-12B29F0D0CB1}">
+<file path=customXml/itemProps3.xml><?xml version="1.0" encoding="utf-8"?>
+<ds:datastoreItem xmlns:ds="http://schemas.openxmlformats.org/officeDocument/2006/customXml" ds:itemID="{B99CBB0A-662A-4A92-8A4E-68C02AD54ACD}">
   <ds:schemaRefs>
-    <ds:schemaRef ds:uri="http://schemas.microsoft.com/office/2006/metadata/properties"/>
-    <ds:schemaRef ds:uri="http://schemas.microsoft.com/office/infopath/2007/PartnerControls"/>
+    <ds:schemaRef ds:uri="http://schemas.microsoft.com/sharepoint/v3/contenttype/forms"/>
   </ds:schemaRefs>
 </ds:datastoreItem>
 </file>
 
-<file path=customXml/itemProps3.xml><?xml version="1.0" encoding="utf-8"?>
+<file path=customXml/itemProps4.xml><?xml version="1.0" encoding="utf-8"?>
 <ds:datastoreItem xmlns:ds="http://schemas.openxmlformats.org/officeDocument/2006/customXml" ds:itemID="{99BE0D53-B08D-44F0-9E0B-4BFC01292C66}">
   <ds:schemaRefs>
     <ds:schemaRef ds:uri="http://schemas.openxmlformats.org/officeDocument/2006/bibliography"/>
   </ds:schemaRefs>
 </ds:datastoreItem>
-</file>
-
-<file path=customXml/itemProps4.xml><?xml version="1.0" encoding="utf-8"?>
-<ds:datastoreItem xmlns:ds="http://schemas.openxmlformats.org/officeDocument/2006/customXml" ds:itemID="{B99CBB0A-662A-4A92-8A4E-68C02AD54ACD}">
-  <ds:schemaRefs>
-    <ds:schemaRef ds:uri="http://schemas.microsoft.com/sharepoint/v3/contenttype/forms"/>
-  </ds:schemaRefs>
-</ds:datastoreItem>
 </file>
</xml_diff>

<commit_message>
Fix extraction hallucinations and template collision
- Fix MN1/MN2 template collision with prefix stripping
- Add chief complaint hallucination detection and sanitization
- Add HPI hallucination phrase removal
- Correct lab flags (eGFR/HGB/HCT direction)
- Add medication dose/frequency validation (Sinemet fix)
- Calculate age from DOB instead of LLM extraction
- Add flow_quality Langfuse scoring for template issues
- Update debug.html header to green (verification mode)
- Expand hallucination phrase detection list
</commit_message>
<xml_diff>
--- a/appeal_templates/Template.docx
+++ b/appeal_templates/Template.docx
@@ -312,77 +312,7 @@
           <w:sz w:val="20"/>
           <w:szCs w:val="20"/>
         </w:rPr>
-        <w:t>[</w:t>
-      </w:r>
-      <w:proofErr w:type="spellStart"/>
-      <w:r>
-        <w:rPr>
-          <w:rFonts w:ascii="Arial" w:hAnsi="Arial" w:cs="Arial"/>
-          <w:sz w:val="20"/>
-          <w:szCs w:val="20"/>
-        </w:rPr>
-        <w:t>MemberName</w:t>
-      </w:r>
-      <w:proofErr w:type="spellEnd"/>
-      <w:r>
-        <w:rPr>
-          <w:rFonts w:ascii="Arial" w:hAnsi="Arial" w:cs="Arial"/>
-          <w:sz w:val="20"/>
-          <w:szCs w:val="20"/>
-        </w:rPr>
-        <w:t>] is a [Age]-year-old [Gender] with past medical history of [</w:t>
-      </w:r>
-      <w:proofErr w:type="spellStart"/>
-      <w:r>
-        <w:rPr>
-          <w:rFonts w:ascii="Arial" w:hAnsi="Arial" w:cs="Arial"/>
-          <w:sz w:val="20"/>
-          <w:szCs w:val="20"/>
-        </w:rPr>
-        <w:t>MedicalHistory</w:t>
-      </w:r>
-      <w:proofErr w:type="spellEnd"/>
-      <w:r>
-        <w:rPr>
-          <w:rFonts w:ascii="Arial" w:hAnsi="Arial" w:cs="Arial"/>
-          <w:sz w:val="20"/>
-          <w:szCs w:val="20"/>
-        </w:rPr>
-        <w:t>], who presented to the [</w:t>
-      </w:r>
-      <w:proofErr w:type="spellStart"/>
-      <w:r>
-        <w:rPr>
-          <w:rFonts w:ascii="Arial" w:hAnsi="Arial" w:cs="Arial"/>
-          <w:sz w:val="20"/>
-          <w:szCs w:val="20"/>
-        </w:rPr>
-        <w:t>PlaceofService</w:t>
-      </w:r>
-      <w:proofErr w:type="spellEnd"/>
-      <w:r>
-        <w:rPr>
-          <w:rFonts w:ascii="Arial" w:hAnsi="Arial" w:cs="Arial"/>
-          <w:sz w:val="20"/>
-          <w:szCs w:val="20"/>
-        </w:rPr>
-        <w:t xml:space="preserve">] on [DOS] for </w:t>
-      </w:r>
-      <w:r>
-        <w:rPr>
-          <w:rFonts w:ascii="Arial" w:hAnsi="Arial" w:cs="Arial"/>
-          <w:sz w:val="20"/>
-          <w:szCs w:val="20"/>
-        </w:rPr>
-        <w:t>[</w:t>
-      </w:r>
-      <w:r>
-        <w:rPr>
-          <w:rFonts w:ascii="Arial" w:hAnsi="Arial" w:cs="Arial"/>
-          <w:sz w:val="20"/>
-          <w:szCs w:val="20"/>
-        </w:rPr>
-        <w:t xml:space="preserve">Complaint]. </w:t>
+        <w:t>Your member was admitted inpatient due to [Conditions].</w:t>
       </w:r>
     </w:p>
     <w:p>
@@ -656,7 +586,6 @@
           <w:sz w:val="20"/>
           <w:szCs w:val="20"/>
         </w:rPr>
-        <w:lastRenderedPageBreak/>
         <w:t xml:space="preserve">Additionally note that per CMS, reconsideration dismissals are addressed under Subpart M §422.582 (f), and instances where enrollees are without financial liability fall outside of Subpart M. </w:t>
       </w:r>
     </w:p>

</xml_diff>

<commit_message>
Fix hook hallucinations: split into presenting_symptom + pmh_relevant with strict copy-only extraction
- Split hook into 2 discrete fields: presenting_symptom (acute symptoms) and pmh_relevant (1-3 relevant PMH conditions)
- Updated UI to make both fields separately clickable/editable in preview
- Added stern anti-hallucination preamble emphasizing this is real patient data
- Added post-extraction validation for ages in HPI, medication frequencies
- Tightened lab date validation - reject fabricated dates
- Updated prompts to require VERBATIM copying, not paraphrasing
- Limited pmh_relevant to 1-3 most relevant items
- Fixed f-string escaping bug causing 'presenting_symptom' variable error
- Updated gitignore for temp files
</commit_message>
<xml_diff>
--- a/appeal_templates/Template.docx
+++ b/appeal_templates/Template.docx
@@ -312,7 +312,73 @@
           <w:sz w:val="20"/>
           <w:szCs w:val="20"/>
         </w:rPr>
-        <w:t>Your member was admitted inpatient due to [Conditions].</w:t>
+        <w:t xml:space="preserve">Your member was admitted inpatient due to </w:t>
+      </w:r>
+      <w:r>
+        <w:rPr>
+          <w:rFonts w:ascii="Arial" w:hAnsi="Arial" w:cs="Arial"/>
+          <w:sz w:val="20"/>
+          <w:szCs w:val="20"/>
+        </w:rPr>
+        <w:t>[</w:t>
+      </w:r>
+      <w:proofErr w:type="spellStart"/>
+      <w:r>
+        <w:rPr>
+          <w:rFonts w:ascii="Arial" w:hAnsi="Arial" w:cs="Arial"/>
+          <w:sz w:val="20"/>
+          <w:szCs w:val="20"/>
+        </w:rPr>
+        <w:t>PresentingSymptom</w:t>
+      </w:r>
+      <w:proofErr w:type="spellEnd"/>
+      <w:r>
+        <w:rPr>
+          <w:rFonts w:ascii="Arial" w:hAnsi="Arial" w:cs="Arial"/>
+          <w:sz w:val="20"/>
+          <w:szCs w:val="20"/>
+        </w:rPr>
+        <w:t>] with [</w:t>
+      </w:r>
+      <w:r>
+        <w:rPr>
+          <w:rFonts w:ascii="Arial" w:hAnsi="Arial" w:cs="Arial"/>
+          <w:sz w:val="20"/>
+          <w:szCs w:val="20"/>
+        </w:rPr>
+        <w:t>PMHRelevant</w:t>
+      </w:r>
+      <w:r>
+        <w:rPr>
+          <w:rFonts w:ascii="Arial" w:hAnsi="Arial" w:cs="Arial"/>
+          <w:sz w:val="20"/>
+          <w:szCs w:val="20"/>
+        </w:rPr>
+        <w:t xml:space="preserve">], </w:t>
+      </w:r>
+      <w:r>
+        <w:rPr>
+          <w:rFonts w:ascii="Arial" w:hAnsi="Arial" w:cs="Arial"/>
+          <w:sz w:val="20"/>
+          <w:szCs w:val="20"/>
+        </w:rPr>
+        <w:t>requiring hospital-level evaluation, treatment, and</w:t>
+      </w:r>
+      <w:r>
+        <w:rPr>
+          <w:rFonts w:ascii="Arial" w:hAnsi="Arial" w:cs="Arial"/>
+          <w:sz w:val="20"/>
+          <w:szCs w:val="20"/>
+        </w:rPr>
+        <w:t xml:space="preserve"> </w:t>
+      </w:r>
+      <w:r>
+        <w:rPr>
+          <w:rFonts w:ascii="Arial" w:hAnsi="Arial" w:cs="Arial"/>
+          <w:sz w:val="20"/>
+          <w:szCs w:val="20"/>
+        </w:rPr>
+        <w:t>monitoring.</w:t>
       </w:r>
     </w:p>
     <w:p>
@@ -586,6 +652,7 @@
           <w:sz w:val="20"/>
           <w:szCs w:val="20"/>
         </w:rPr>
+        <w:lastRenderedPageBreak/>
         <w:t xml:space="preserve">Additionally note that per CMS, reconsideration dismissals are addressed under Subpart M §422.582 (f), and instances where enrollees are without financial liability fall outside of Subpart M. </w:t>
       </w:r>
     </w:p>
@@ -2742,6 +2809,19 @@
 </file>
 
 <file path=customXml/item2.xml><?xml version="1.0" encoding="utf-8"?>
+<b:Sources xmlns:b="http://schemas.openxmlformats.org/officeDocument/2006/bibliography" xmlns="http://schemas.openxmlformats.org/officeDocument/2006/bibliography" SelectedStyle="\APASixthEditionOfficeOnline.xsl" StyleName="APA" Version="6"/>
+</file>
+
+<file path=customXml/item3.xml><?xml version="1.0" encoding="utf-8"?>
+<?mso-contentType ?>
+<FormTemplates xmlns="http://schemas.microsoft.com/sharepoint/v3/contenttype/forms">
+  <Display>DocumentLibraryForm</Display>
+  <Edit>DocumentLibraryForm</Edit>
+  <New>DocumentLibraryForm</New>
+</FormTemplates>
+</file>
+
+<file path=customXml/item4.xml><?xml version="1.0" encoding="utf-8"?>
 <ct:contentTypeSchema xmlns:ct="http://schemas.microsoft.com/office/2006/metadata/contentType" xmlns:ma="http://schemas.microsoft.com/office/2006/metadata/properties/metaAttributes" ct:_="" ma:_="" ma:contentTypeName="Document" ma:contentTypeID="0x0101000A114B0B3830C04AB963F756186C82BD" ma:contentTypeVersion="3" ma:contentTypeDescription="Create a new document." ma:contentTypeScope="" ma:versionID="da4925ea29c2577d7340c01072ff392d">
   <xsd:schema xmlns:xsd="http://www.w3.org/2001/XMLSchema" xmlns:xs="http://www.w3.org/2001/XMLSchema" xmlns:p="http://schemas.microsoft.com/office/2006/metadata/properties" xmlns:ns2="6b3e150c-167c-4381-8b11-1779c06e76d3" targetNamespace="http://schemas.microsoft.com/office/2006/metadata/properties" ma:root="true" ma:fieldsID="942a06f3e13e5d125af727ff383ccc47" ns2:_="">
     <xsd:import namespace="6b3e150c-167c-4381-8b11-1779c06e76d3"/>
@@ -2879,19 +2959,6 @@
 </ct:contentTypeSchema>
 </file>
 
-<file path=customXml/item3.xml><?xml version="1.0" encoding="utf-8"?>
-<?mso-contentType ?>
-<FormTemplates xmlns="http://schemas.microsoft.com/sharepoint/v3/contenttype/forms">
-  <Display>DocumentLibraryForm</Display>
-  <Edit>DocumentLibraryForm</Edit>
-  <New>DocumentLibraryForm</New>
-</FormTemplates>
-</file>
-
-<file path=customXml/item4.xml><?xml version="1.0" encoding="utf-8"?>
-<b:Sources xmlns:b="http://schemas.openxmlformats.org/officeDocument/2006/bibliography" xmlns="http://schemas.openxmlformats.org/officeDocument/2006/bibliography" SelectedStyle="\APASixthEditionOfficeOnline.xsl" StyleName="APA" Version="6"/>
-</file>
-
 <file path=customXml/itemProps1.xml><?xml version="1.0" encoding="utf-8"?>
 <ds:datastoreItem xmlns:ds="http://schemas.openxmlformats.org/officeDocument/2006/customXml" ds:itemID="{0CDF7EEF-1D5F-4E5B-B336-12B29F0D0CB1}">
   <ds:schemaRefs>
@@ -2902,6 +2969,22 @@
 </file>
 
 <file path=customXml/itemProps2.xml><?xml version="1.0" encoding="utf-8"?>
+<ds:datastoreItem xmlns:ds="http://schemas.openxmlformats.org/officeDocument/2006/customXml" ds:itemID="{99BE0D53-B08D-44F0-9E0B-4BFC01292C66}">
+  <ds:schemaRefs>
+    <ds:schemaRef ds:uri="http://schemas.openxmlformats.org/officeDocument/2006/bibliography"/>
+  </ds:schemaRefs>
+</ds:datastoreItem>
+</file>
+
+<file path=customXml/itemProps3.xml><?xml version="1.0" encoding="utf-8"?>
+<ds:datastoreItem xmlns:ds="http://schemas.openxmlformats.org/officeDocument/2006/customXml" ds:itemID="{B99CBB0A-662A-4A92-8A4E-68C02AD54ACD}">
+  <ds:schemaRefs>
+    <ds:schemaRef ds:uri="http://schemas.microsoft.com/sharepoint/v3/contenttype/forms"/>
+  </ds:schemaRefs>
+</ds:datastoreItem>
+</file>
+
+<file path=customXml/itemProps4.xml><?xml version="1.0" encoding="utf-8"?>
 <ds:datastoreItem xmlns:ds="http://schemas.openxmlformats.org/officeDocument/2006/customXml" ds:itemID="{0F0D98F9-9E41-4A41-96FC-B8FE3225B420}">
   <ds:schemaRefs>
     <ds:schemaRef ds:uri="http://schemas.microsoft.com/office/2006/metadata/contentType"/>
@@ -2917,20 +3000,4 @@
     <ds:schemaRef ds:uri="http://schemas.microsoft.com/internal/obd"/>
   </ds:schemaRefs>
 </ds:datastoreItem>
-</file>
-
-<file path=customXml/itemProps3.xml><?xml version="1.0" encoding="utf-8"?>
-<ds:datastoreItem xmlns:ds="http://schemas.openxmlformats.org/officeDocument/2006/customXml" ds:itemID="{B99CBB0A-662A-4A92-8A4E-68C02AD54ACD}">
-  <ds:schemaRefs>
-    <ds:schemaRef ds:uri="http://schemas.microsoft.com/sharepoint/v3/contenttype/forms"/>
-  </ds:schemaRefs>
-</ds:datastoreItem>
-</file>
-
-<file path=customXml/itemProps4.xml><?xml version="1.0" encoding="utf-8"?>
-<ds:datastoreItem xmlns:ds="http://schemas.openxmlformats.org/officeDocument/2006/customXml" ds:itemID="{99BE0D53-B08D-44F0-9E0B-4BFC01292C66}">
-  <ds:schemaRefs>
-    <ds:schemaRef ds:uri="http://schemas.openxmlformats.org/officeDocument/2006/bibliography"/>
-  </ds:schemaRefs>
-</ds:datastoreItem>
 </file>
</xml_diff>

<commit_message>
Fix age field, substance abuse exclusion, template alignment, MN2 shortening, debug UI hook display
</commit_message>
<xml_diff>
--- a/appeal_templates/Template.docx
+++ b/appeal_templates/Template.docx
@@ -340,6 +340,7 @@
         </w:rPr>
         <w:t>] with [</w:t>
       </w:r>
+      <w:proofErr w:type="spellStart"/>
       <w:r>
         <w:rPr>
           <w:rFonts w:ascii="Arial" w:hAnsi="Arial" w:cs="Arial"/>
@@ -348,6 +349,7 @@
         </w:rPr>
         <w:t>PMHRelevant</w:t>
       </w:r>
+      <w:proofErr w:type="spellEnd"/>
       <w:r>
         <w:rPr>
           <w:rFonts w:ascii="Arial" w:hAnsi="Arial" w:cs="Arial"/>
@@ -428,6 +430,62 @@
         </w:rPr>
         <w:t xml:space="preserve"> continued to require inpatient care for [MidnightReason1].</w:t>
       </w:r>
+    </w:p>
+    <w:p>
+      <w:pPr>
+        <w:ind w:left="720"/>
+        <w:jc w:val="both"/>
+        <w:rPr>
+          <w:rFonts w:ascii="Arial" w:hAnsi="Arial" w:cs="Arial"/>
+          <w:sz w:val="20"/>
+          <w:szCs w:val="20"/>
+        </w:rPr>
+      </w:pPr>
+    </w:p>
+    <w:p>
+      <w:pPr>
+        <w:ind w:left="720"/>
+        <w:jc w:val="both"/>
+        <w:rPr>
+          <w:rFonts w:ascii="Arial" w:hAnsi="Arial" w:cs="Arial"/>
+          <w:sz w:val="20"/>
+          <w:szCs w:val="20"/>
+        </w:rPr>
+      </w:pPr>
+      <w:r>
+        <w:rPr>
+          <w:rFonts w:ascii="Arial" w:hAnsi="Arial" w:cs="Arial"/>
+          <w:sz w:val="20"/>
+          <w:szCs w:val="20"/>
+        </w:rPr>
+        <w:t xml:space="preserve">During the </w:t>
+      </w:r>
+      <w:r>
+        <w:rPr>
+          <w:rFonts w:ascii="Arial" w:hAnsi="Arial" w:cs="Arial"/>
+          <w:sz w:val="20"/>
+          <w:szCs w:val="20"/>
+        </w:rPr>
+        <w:t xml:space="preserve">second </w:t>
+      </w:r>
+      <w:r>
+        <w:rPr>
+          <w:rFonts w:ascii="Arial" w:hAnsi="Arial" w:cs="Arial"/>
+          <w:sz w:val="20"/>
+          <w:szCs w:val="20"/>
+        </w:rPr>
+        <w:t xml:space="preserve">midnight, the </w:t>
+      </w:r>
+      <w:proofErr w:type="gramStart"/>
+      <w:r>
+        <w:rPr>
+          <w:rFonts w:ascii="Arial" w:hAnsi="Arial" w:cs="Arial"/>
+          <w:sz w:val="20"/>
+          <w:szCs w:val="20"/>
+        </w:rPr>
+        <w:t>member</w:t>
+      </w:r>
+      <w:proofErr w:type="gramEnd"/>
       <w:r>
         <w:rPr>
           <w:rFonts w:ascii="Arial" w:hAnsi="Arial" w:cs="Arial"/>
@@ -436,85 +494,13 @@
         </w:rPr>
         <w:t xml:space="preserve"> </w:t>
       </w:r>
-    </w:p>
-    <w:p>
-      <w:pPr>
-        <w:ind w:left="720"/>
-        <w:jc w:val="both"/>
-        <w:rPr>
-          <w:rFonts w:ascii="Arial" w:hAnsi="Arial" w:cs="Arial"/>
-          <w:sz w:val="20"/>
-          <w:szCs w:val="20"/>
-        </w:rPr>
-      </w:pPr>
-    </w:p>
-    <w:p>
-      <w:pPr>
-        <w:ind w:left="576" w:firstLine="144"/>
-        <w:jc w:val="both"/>
-        <w:rPr>
-          <w:rFonts w:ascii="Arial" w:hAnsi="Arial" w:cs="Arial"/>
-          <w:sz w:val="20"/>
-          <w:szCs w:val="20"/>
-        </w:rPr>
-      </w:pPr>
-      <w:r>
-        <w:rPr>
-          <w:rFonts w:ascii="Arial" w:hAnsi="Arial" w:cs="Arial"/>
-          <w:sz w:val="20"/>
-          <w:szCs w:val="20"/>
-        </w:rPr>
-        <w:t xml:space="preserve">During the second midnight, the </w:t>
-      </w:r>
-      <w:proofErr w:type="gramStart"/>
-      <w:r>
-        <w:rPr>
-          <w:rFonts w:ascii="Arial" w:hAnsi="Arial" w:cs="Arial"/>
-          <w:sz w:val="20"/>
-          <w:szCs w:val="20"/>
-        </w:rPr>
-        <w:t>member</w:t>
-      </w:r>
-      <w:proofErr w:type="gramEnd"/>
-      <w:r>
-        <w:rPr>
-          <w:rFonts w:ascii="Arial" w:hAnsi="Arial" w:cs="Arial"/>
-          <w:sz w:val="20"/>
-          <w:szCs w:val="20"/>
-        </w:rPr>
-        <w:t xml:space="preserve"> still required hospital-level care due to</w:t>
-      </w:r>
-      <w:r>
-        <w:rPr>
-          <w:rFonts w:ascii="Arial" w:hAnsi="Arial" w:cs="Arial"/>
-          <w:sz w:val="20"/>
-          <w:szCs w:val="20"/>
-        </w:rPr>
-        <w:t xml:space="preserve"> </w:t>
-      </w:r>
-      <w:r>
-        <w:rPr>
-          <w:rFonts w:ascii="Arial" w:hAnsi="Arial" w:cs="Arial"/>
-          <w:sz w:val="20"/>
-          <w:szCs w:val="20"/>
-        </w:rPr>
-        <w:t>[MidnightReason</w:t>
-      </w:r>
-      <w:r>
-        <w:rPr>
-          <w:rFonts w:ascii="Arial" w:hAnsi="Arial" w:cs="Arial"/>
-          <w:sz w:val="20"/>
-          <w:szCs w:val="20"/>
-        </w:rPr>
-        <w:t>2</w:t>
-      </w:r>
-      <w:r>
-        <w:rPr>
-          <w:rFonts w:ascii="Arial" w:hAnsi="Arial" w:cs="Arial"/>
-          <w:sz w:val="20"/>
-          <w:szCs w:val="20"/>
-        </w:rPr>
-        <w:t>].</w:t>
+      <w:r>
+        <w:rPr>
+          <w:rFonts w:ascii="Arial" w:hAnsi="Arial" w:cs="Arial"/>
+          <w:sz w:val="20"/>
+          <w:szCs w:val="20"/>
+        </w:rPr>
+        <w:t>still required hospital-level care due to [MidnightReason2].</w:t>
       </w:r>
     </w:p>
     <w:p>
@@ -2264,6 +2250,7 @@
   <w:style w:type="character" w:default="1" w:styleId="DefaultParagraphFont">
     <w:name w:val="Default Paragraph Font"/>
     <w:uiPriority w:val="1"/>
+    <w:semiHidden/>
     <w:unhideWhenUsed/>
   </w:style>
   <w:style w:type="table" w:default="1" w:styleId="TableNormal">
@@ -2803,25 +2790,6 @@
 </file>
 
 <file path=customXml/item1.xml><?xml version="1.0" encoding="utf-8"?>
-<p:properties xmlns:p="http://schemas.microsoft.com/office/2006/metadata/properties" xmlns:xsi="http://www.w3.org/2001/XMLSchema-instance" xmlns:pc="http://schemas.microsoft.com/office/infopath/2007/PartnerControls">
-  <documentManagement/>
-</p:properties>
-</file>
-
-<file path=customXml/item2.xml><?xml version="1.0" encoding="utf-8"?>
-<b:Sources xmlns:b="http://schemas.openxmlformats.org/officeDocument/2006/bibliography" xmlns="http://schemas.openxmlformats.org/officeDocument/2006/bibliography" SelectedStyle="\APASixthEditionOfficeOnline.xsl" StyleName="APA" Version="6"/>
-</file>
-
-<file path=customXml/item3.xml><?xml version="1.0" encoding="utf-8"?>
-<?mso-contentType ?>
-<FormTemplates xmlns="http://schemas.microsoft.com/sharepoint/v3/contenttype/forms">
-  <Display>DocumentLibraryForm</Display>
-  <Edit>DocumentLibraryForm</Edit>
-  <New>DocumentLibraryForm</New>
-</FormTemplates>
-</file>
-
-<file path=customXml/item4.xml><?xml version="1.0" encoding="utf-8"?>
 <ct:contentTypeSchema xmlns:ct="http://schemas.microsoft.com/office/2006/metadata/contentType" xmlns:ma="http://schemas.microsoft.com/office/2006/metadata/properties/metaAttributes" ct:_="" ma:_="" ma:contentTypeName="Document" ma:contentTypeID="0x0101000A114B0B3830C04AB963F756186C82BD" ma:contentTypeVersion="3" ma:contentTypeDescription="Create a new document." ma:contentTypeScope="" ma:versionID="da4925ea29c2577d7340c01072ff392d">
   <xsd:schema xmlns:xsd="http://www.w3.org/2001/XMLSchema" xmlns:xs="http://www.w3.org/2001/XMLSchema" xmlns:p="http://schemas.microsoft.com/office/2006/metadata/properties" xmlns:ns2="6b3e150c-167c-4381-8b11-1779c06e76d3" targetNamespace="http://schemas.microsoft.com/office/2006/metadata/properties" ma:root="true" ma:fieldsID="942a06f3e13e5d125af727ff383ccc47" ns2:_="">
     <xsd:import namespace="6b3e150c-167c-4381-8b11-1779c06e76d3"/>
@@ -2959,32 +2927,26 @@
 </ct:contentTypeSchema>
 </file>
 
-<file path=customXml/itemProps1.xml><?xml version="1.0" encoding="utf-8"?>
-<ds:datastoreItem xmlns:ds="http://schemas.openxmlformats.org/officeDocument/2006/customXml" ds:itemID="{0CDF7EEF-1D5F-4E5B-B336-12B29F0D0CB1}">
-  <ds:schemaRefs>
-    <ds:schemaRef ds:uri="http://schemas.microsoft.com/office/2006/metadata/properties"/>
-    <ds:schemaRef ds:uri="http://schemas.microsoft.com/office/infopath/2007/PartnerControls"/>
-  </ds:schemaRefs>
-</ds:datastoreItem>
+<file path=customXml/item2.xml><?xml version="1.0" encoding="utf-8"?>
+<p:properties xmlns:p="http://schemas.microsoft.com/office/2006/metadata/properties" xmlns:xsi="http://www.w3.org/2001/XMLSchema-instance" xmlns:pc="http://schemas.microsoft.com/office/infopath/2007/PartnerControls">
+  <documentManagement/>
+</p:properties>
 </file>
 
-<file path=customXml/itemProps2.xml><?xml version="1.0" encoding="utf-8"?>
-<ds:datastoreItem xmlns:ds="http://schemas.openxmlformats.org/officeDocument/2006/customXml" ds:itemID="{99BE0D53-B08D-44F0-9E0B-4BFC01292C66}">
-  <ds:schemaRefs>
-    <ds:schemaRef ds:uri="http://schemas.openxmlformats.org/officeDocument/2006/bibliography"/>
-  </ds:schemaRefs>
-</ds:datastoreItem>
+<file path=customXml/item3.xml><?xml version="1.0" encoding="utf-8"?>
+<b:Sources xmlns:b="http://schemas.openxmlformats.org/officeDocument/2006/bibliography" xmlns="http://schemas.openxmlformats.org/officeDocument/2006/bibliography" SelectedStyle="\APASixthEditionOfficeOnline.xsl" StyleName="APA" Version="6"/>
 </file>
 
-<file path=customXml/itemProps3.xml><?xml version="1.0" encoding="utf-8"?>
-<ds:datastoreItem xmlns:ds="http://schemas.openxmlformats.org/officeDocument/2006/customXml" ds:itemID="{B99CBB0A-662A-4A92-8A4E-68C02AD54ACD}">
-  <ds:schemaRefs>
-    <ds:schemaRef ds:uri="http://schemas.microsoft.com/sharepoint/v3/contenttype/forms"/>
-  </ds:schemaRefs>
-</ds:datastoreItem>
+<file path=customXml/item4.xml><?xml version="1.0" encoding="utf-8"?>
+<?mso-contentType ?>
+<FormTemplates xmlns="http://schemas.microsoft.com/sharepoint/v3/contenttype/forms">
+  <Display>DocumentLibraryForm</Display>
+  <Edit>DocumentLibraryForm</Edit>
+  <New>DocumentLibraryForm</New>
+</FormTemplates>
 </file>
 
-<file path=customXml/itemProps4.xml><?xml version="1.0" encoding="utf-8"?>
+<file path=customXml/itemProps1.xml><?xml version="1.0" encoding="utf-8"?>
 <ds:datastoreItem xmlns:ds="http://schemas.openxmlformats.org/officeDocument/2006/customXml" ds:itemID="{0F0D98F9-9E41-4A41-96FC-B8FE3225B420}">
   <ds:schemaRefs>
     <ds:schemaRef ds:uri="http://schemas.microsoft.com/office/2006/metadata/contentType"/>
@@ -3000,4 +2962,29 @@
     <ds:schemaRef ds:uri="http://schemas.microsoft.com/internal/obd"/>
   </ds:schemaRefs>
 </ds:datastoreItem>
+</file>
+
+<file path=customXml/itemProps2.xml><?xml version="1.0" encoding="utf-8"?>
+<ds:datastoreItem xmlns:ds="http://schemas.openxmlformats.org/officeDocument/2006/customXml" ds:itemID="{0CDF7EEF-1D5F-4E5B-B336-12B29F0D0CB1}">
+  <ds:schemaRefs>
+    <ds:schemaRef ds:uri="http://schemas.microsoft.com/office/2006/metadata/properties"/>
+    <ds:schemaRef ds:uri="http://schemas.microsoft.com/office/infopath/2007/PartnerControls"/>
+  </ds:schemaRefs>
+</ds:datastoreItem>
+</file>
+
+<file path=customXml/itemProps3.xml><?xml version="1.0" encoding="utf-8"?>
+<ds:datastoreItem xmlns:ds="http://schemas.openxmlformats.org/officeDocument/2006/customXml" ds:itemID="{99BE0D53-B08D-44F0-9E0B-4BFC01292C66}">
+  <ds:schemaRefs>
+    <ds:schemaRef ds:uri="http://schemas.openxmlformats.org/officeDocument/2006/bibliography"/>
+  </ds:schemaRefs>
+</ds:datastoreItem>
+</file>
+
+<file path=customXml/itemProps4.xml><?xml version="1.0" encoding="utf-8"?>
+<ds:datastoreItem xmlns:ds="http://schemas.openxmlformats.org/officeDocument/2006/customXml" ds:itemID="{B99CBB0A-662A-4A92-8A4E-68C02AD54ACD}">
+  <ds:schemaRefs>
+    <ds:schemaRef ds:uri="http://schemas.microsoft.com/sharepoint/v3/contenttype/forms"/>
+  </ds:schemaRefs>
+</ds:datastoreItem>
 </file>
</xml_diff>